<commit_message>
CF-247 e148: R22 and R18 done; developer guide issue 4; register v2.2
Co-Authored-By: Claude Opus 5.5 <noreply@anthropic.com>
Claude-Session: https://claude.ai/code/session_01RnriTf32Hcv4Xqnq2DF1qq
</commit_message>
<xml_diff>
--- a/docs/integrations/developer-pack/StudySearch-Website-API-v2-Developer-Guide.docx
+++ b/docs/integrations/developer-pack/StudySearch-Website-API-v2-Developer-Guide.docx
@@ -87,7 +87,7 @@
         <w:t xml:space="preserve"> </w:t>
       </w:r>
       <w:r>
-        <w:t xml:space="preserve">3</w:t>
+        <w:t xml:space="preserve">4</w:t>
       </w:r>
       <w:r>
         <w:t xml:space="preserve"> </w:t>
@@ -99,7 +99,7 @@
         <w:t xml:space="preserve"> </w:t>
       </w:r>
       <w:r>
-        <w:t xml:space="preserve">16</w:t>
+        <w:t xml:space="preserve">17</w:t>
       </w:r>
       <w:r>
         <w:t xml:space="preserve"> </w:t>
@@ -1279,6 +1279,33 @@
       </w:r>
       <w:r>
         <w:t xml:space="preserve">pages are covered in section 6.</w:t>
+      </w:r>
+    </w:p>
+    <w:p>
+      <w:pPr>
+        <w:numPr>
+          <w:ilvl w:val="0"/>
+          <w:numId w:val="1004"/>
+        </w:numPr>
+        <w:pStyle w:val="Compact"/>
+      </w:pPr>
+      <w:r>
+        <w:t xml:space="preserve">Send</w:t>
+      </w:r>
+      <w:r>
+        <w:t xml:space="preserve"> </w:t>
+      </w:r>
+      <w:r>
+        <w:rPr>
+          <w:rStyle w:val="VerbatimChar"/>
+        </w:rPr>
+        <w:t xml:space="preserve">Accept-Encoding: gzip</w:t>
+      </w:r>
+      <w:r>
+        <w:t xml:space="preserve"> </w:t>
+      </w:r>
+      <w:r>
+        <w:t xml:space="preserve">(most HTTP clients do this by default). Replies are then compressed to about a ninth of their size.</w:t>
       </w:r>
     </w:p>
     <w:p>
@@ -2504,7 +2531,7 @@
         <w:rPr>
           <w:rStyle w:val="DecValTok"/>
         </w:rPr>
-        <w:t xml:space="preserve">200</w:t>
+        <w:t xml:space="preserve">600</w:t>
       </w:r>
       <w:r>
         <w:br/>
@@ -2957,7 +2984,7 @@
               <w:jc w:val="left"/>
             </w:pPr>
             <w:r>
-              <w:t xml:space="preserve">1–200 (default 200). A page also stops at about 550 KB, so large items (provider details, scholarships) come fewer to a page</w:t>
+              <w:t xml:space="preserve">1–600 (default 600). A page holds at most about 1.7 MB of JSON (about 0.15 MB compressed), so large items (provider details, scholarships) come fewer to a page</w:t>
             </w:r>
           </w:p>
         </w:tc>
@@ -3985,7 +4012,7 @@
         <w:pStyle w:val="FirstParagraph"/>
       </w:pPr>
       <w:r>
-        <w:t xml:space="preserve">Measured on Pilot on 16 October 2026.</w:t>
+        <w:t xml:space="preserve">Measured on Pilot on 17 October 2026.</w:t>
       </w:r>
     </w:p>
     <w:tbl>
@@ -4069,7 +4096,7 @@
               <w:jc w:val="left"/>
             </w:pPr>
             <w:r>
-              <w:t xml:space="preserve">About 41,700 (courses 37,300; providers 1,885; scholarships 1,100; logos 1,399; ranking sets 56; reference 1)</w:t>
+              <w:t xml:space="preserve">About 41,900 (courses 37,300; providers 1,885; scholarships 1,100; logos 1,550; ranking sets 56; reference 1)</w:t>
             </w:r>
           </w:p>
         </w:tc>
@@ -4095,7 +4122,7 @@
               <w:jc w:val="left"/>
             </w:pPr>
             <w:r>
-              <w:t xml:space="preserve">About 260 at the default page size</w:t>
+              <w:t xml:space="preserve">About 86 at the default page size (600)</w:t>
             </w:r>
           </w:p>
         </w:tc>
@@ -4121,7 +4148,19 @@
               <w:jc w:val="left"/>
             </w:pPr>
             <w:r>
-              <w:t xml:space="preserve">About 100 MB of JSON in total; the largest page about 550 KB</w:t>
+              <w:t xml:space="preserve">About 113 MB of JSON in total, about 15 MB compressed with</w:t>
+            </w:r>
+            <w:r>
+              <w:t xml:space="preserve"> </w:t>
+            </w:r>
+            <w:r>
+              <w:rPr>
+                <w:rStyle w:val="VerbatimChar"/>
+              </w:rPr>
+              <w:t xml:space="preserve">Accept-Encoding: gzip</w:t>
+            </w:r>
+            <w:r>
+              <w:t xml:space="preserve">; the largest page about 1.7 MB (the first page 150 KB compressed)</w:t>
             </w:r>
           </w:p>
         </w:tc>
@@ -4147,7 +4186,7 @@
               <w:jc w:val="left"/>
             </w:pPr>
             <w:r>
-              <w:t xml:space="preserve">Under a second a page</w:t>
+              <w:t xml:space="preserve">Under a second a page; the platform builds a page in under 0.3 seconds</w:t>
             </w:r>
           </w:p>
         </w:tc>
@@ -4173,7 +4212,7 @@
               <w:jc w:val="left"/>
             </w:pPr>
             <w:r>
-              <w:t xml:space="preserve">About 5 minutes (one page at a time)</w:t>
+              <w:t xml:space="preserve">About 1 to 2 minutes (one page at a time)</w:t>
             </w:r>
           </w:p>
         </w:tc>
@@ -6651,7 +6690,85 @@
               <w:jc w:val="left"/>
             </w:pPr>
             <w:r>
-              <w:t xml:space="preserve">Courses whose minimum overall score for that test is at or below the score. Give exactly one test code with a score</w:t>
+              <w:t xml:space="preserve">Courses whose minimum overall score for that test is at or below the score, on that test’s own scale. Give exactly one test code with a score. Test codes:</w:t>
+            </w:r>
+            <w:r>
+              <w:t xml:space="preserve"> </w:t>
+            </w:r>
+            <w:r>
+              <w:rPr>
+                <w:rStyle w:val="VerbatimChar"/>
+              </w:rPr>
+              <w:t xml:space="preserve">IELTS</w:t>
+            </w:r>
+            <w:r>
+              <w:t xml:space="preserve">,</w:t>
+            </w:r>
+            <w:r>
+              <w:t xml:space="preserve"> </w:t>
+            </w:r>
+            <w:r>
+              <w:rPr>
+                <w:rStyle w:val="VerbatimChar"/>
+              </w:rPr>
+              <w:t xml:space="preserve">PTE</w:t>
+            </w:r>
+            <w:r>
+              <w:t xml:space="preserve">,</w:t>
+            </w:r>
+            <w:r>
+              <w:t xml:space="preserve"> </w:t>
+            </w:r>
+            <w:r>
+              <w:rPr>
+                <w:rStyle w:val="VerbatimChar"/>
+              </w:rPr>
+              <w:t xml:space="preserve">TOEFL_IBT</w:t>
+            </w:r>
+            <w:r>
+              <w:t xml:space="preserve">,</w:t>
+            </w:r>
+            <w:r>
+              <w:t xml:space="preserve"> </w:t>
+            </w:r>
+            <w:r>
+              <w:rPr>
+                <w:rStyle w:val="VerbatimChar"/>
+              </w:rPr>
+              <w:t xml:space="preserve">CAE</w:t>
+            </w:r>
+            <w:r>
+              <w:t xml:space="preserve">,</w:t>
+            </w:r>
+            <w:r>
+              <w:t xml:space="preserve"> </w:t>
+            </w:r>
+            <w:r>
+              <w:rPr>
+                <w:rStyle w:val="VerbatimChar"/>
+              </w:rPr>
+              <w:t xml:space="preserve">DET</w:t>
+            </w:r>
+            <w:r>
+              <w:t xml:space="preserve"> </w:t>
+            </w:r>
+            <w:r>
+              <w:t xml:space="preserve">(Duolingo English Test, 10–160);</w:t>
+            </w:r>
+            <w:r>
+              <w:t xml:space="preserve"> </w:t>
+            </w:r>
+            <w:r>
+              <w:rPr>
+                <w:rStyle w:val="VerbatimChar"/>
+              </w:rPr>
+              <w:t xml:space="preserve">reference</w:t>
+            </w:r>
+            <w:r>
+              <w:t xml:space="preserve"> </w:t>
+            </w:r>
+            <w:r>
+              <w:t xml:space="preserve">lists the codes held for each country with course counts</w:t>
             </w:r>
           </w:p>
         </w:tc>
@@ -11751,7 +11868,7 @@
         <w:pStyle w:val="FirstParagraph"/>
       </w:pPr>
       <w:r>
-        <w:t xml:space="preserve">Courses or records the API returns holding a value (16 October 2026; coverage grows daily).</w:t>
+        <w:t xml:space="preserve">Courses or records the API returns holding a value (16 October 2026, Duolingo row 17 October 2026; coverage grows daily).</w:t>
       </w:r>
     </w:p>
     <w:tbl>
@@ -11961,6 +12078,56 @@
               <w:jc w:val="left"/>
             </w:pPr>
             <w:r>
+              <w:t xml:space="preserve">of which Duolingo English Test (DET)</w:t>
+            </w:r>
+          </w:p>
+        </w:tc>
+        <w:tc>
+          <w:tcPr/>
+          <w:p>
+            <w:pPr>
+              <w:pStyle w:val="Compact"/>
+              <w:jc w:val="left"/>
+            </w:pPr>
+            <w:r>
+              <w:t xml:space="preserve">347</w:t>
+            </w:r>
+          </w:p>
+        </w:tc>
+        <w:tc>
+          <w:tcPr/>
+          <w:p>
+            <w:pPr>
+              <w:pStyle w:val="Compact"/>
+              <w:jc w:val="left"/>
+            </w:pPr>
+            <w:r>
+              <w:t xml:space="preserve">0</w:t>
+            </w:r>
+          </w:p>
+        </w:tc>
+        <w:tc>
+          <w:tcPr/>
+          <w:p>
+            <w:pPr>
+              <w:pStyle w:val="Compact"/>
+              <w:jc w:val="left"/>
+            </w:pPr>
+            <w:r>
+              <w:t xml:space="preserve">184</w:t>
+            </w:r>
+          </w:p>
+        </w:tc>
+      </w:tr>
+      <w:tr>
+        <w:tc>
+          <w:tcPr/>
+          <w:p>
+            <w:pPr>
+              <w:pStyle w:val="Compact"/>
+              <w:jc w:val="left"/>
+            </w:pPr>
+            <w:r>
               <w:t xml:space="preserve">Intake months</w:t>
             </w:r>
           </w:p>
@@ -14454,6 +14621,122 @@
             </w:r>
             <w:r>
               <w:t xml:space="preserve">); 300 calls a minute per key, all actions together. Same actions, fields and answers. The earlier address keeps working until you have moved</w:t>
+            </w:r>
+          </w:p>
+        </w:tc>
+      </w:tr>
+      <w:tr>
+        <w:tc>
+          <w:tcPr/>
+          <w:p>
+            <w:pPr>
+              <w:pStyle w:val="Compact"/>
+              <w:jc w:val="left"/>
+            </w:pPr>
+            <w:r>
+              <w:t xml:space="preserve">17 October 2026 (issue 4)</w:t>
+            </w:r>
+          </w:p>
+        </w:tc>
+        <w:tc>
+          <w:tcPr/>
+          <w:p>
+            <w:pPr>
+              <w:pStyle w:val="Compact"/>
+              <w:jc w:val="left"/>
+            </w:pPr>
+            <w:r>
+              <w:rPr>
+                <w:rStyle w:val="VerbatimChar"/>
+              </w:rPr>
+              <w:t xml:space="preserve">sync</w:t>
+            </w:r>
+            <w:r>
+              <w:t xml:space="preserve"> </w:t>
+            </w:r>
+            <w:r>
+              <w:t xml:space="preserve">pages hold up to 600 size units (was 200; default 600): a full load is about 86 calls, about 1 to 2 minutes (was about 260 calls, about 5 minutes); a caller that sends a smaller</w:t>
+            </w:r>
+            <w:r>
+              <w:t xml:space="preserve"> </w:t>
+            </w:r>
+            <w:r>
+              <w:rPr>
+                <w:rStyle w:val="VerbatimChar"/>
+              </w:rPr>
+              <w:t xml:space="preserve">page_size</w:t>
+            </w:r>
+            <w:r>
+              <w:t xml:space="preserve"> </w:t>
+            </w:r>
+            <w:r>
+              <w:t xml:space="preserve">keeps getting smaller pages. Replies are compressed when you send</w:t>
+            </w:r>
+            <w:r>
+              <w:t xml:space="preserve"> </w:t>
+            </w:r>
+            <w:r>
+              <w:rPr>
+                <w:rStyle w:val="VerbatimChar"/>
+              </w:rPr>
+              <w:t xml:space="preserve">Accept-Encoding: gzip</w:t>
+            </w:r>
+            <w:r>
+              <w:t xml:space="preserve"> </w:t>
+            </w:r>
+            <w:r>
+              <w:t xml:space="preserve">(about 15 MB for a full load instead of about 113 MB). New English test code</w:t>
+            </w:r>
+            <w:r>
+              <w:t xml:space="preserve"> </w:t>
+            </w:r>
+            <w:r>
+              <w:rPr>
+                <w:rStyle w:val="VerbatimChar"/>
+              </w:rPr>
+              <w:t xml:space="preserve">DET</w:t>
+            </w:r>
+            <w:r>
+              <w:t xml:space="preserve"> </w:t>
+            </w:r>
+            <w:r>
+              <w:t xml:space="preserve">(Duolingo English Test, overall score 10–160) in</w:t>
+            </w:r>
+            <w:r>
+              <w:t xml:space="preserve"> </w:t>
+            </w:r>
+            <w:r>
+              <w:rPr>
+                <w:rStyle w:val="VerbatimChar"/>
+              </w:rPr>
+              <w:t xml:space="preserve">english_requirements</w:t>
+            </w:r>
+            <w:r>
+              <w:t xml:space="preserve">, the</w:t>
+            </w:r>
+            <w:r>
+              <w:t xml:space="preserve"> </w:t>
+            </w:r>
+            <w:r>
+              <w:rPr>
+                <w:rStyle w:val="VerbatimChar"/>
+              </w:rPr>
+              <w:t xml:space="preserve">english_test_codes</w:t>
+            </w:r>
+            <w:r>
+              <w:t xml:space="preserve"> </w:t>
+            </w:r>
+            <w:r>
+              <w:t xml:space="preserve">filter and</w:t>
+            </w:r>
+            <w:r>
+              <w:t xml:space="preserve"> </w:t>
+            </w:r>
+            <w:r>
+              <w:rPr>
+                <w:rStyle w:val="VerbatimChar"/>
+              </w:rPr>
+              <w:t xml:space="preserve">reference</w:t>
             </w:r>
           </w:p>
         </w:tc>
@@ -14485,7 +14768,7 @@
         <w:color w:val="606060"/>
         <w:sz w:val="16"/>
       </w:rPr>
-      <w:t>website-api-v2 · Version 2 · Issue 3 · 16 October 2026 · Pilot</w:t>
+      <w:t>website-api-v2 · Version 2 · Issue 4 · 17 October 2026 · Pilot</w:t>
     </w:r>
   </w:p>
 </w:ftr>

</xml_diff>

<commit_message>
AER role guides and developer guide §7.9 clarifications (lane F, Workstream 5)
- docs/platform/AER-ROLE-GUIDES.md: task guides for Viewer, Curator, Platform Admin,
  Layer 4 reviewer, website/Zoho integration owner and incident response, with a
  quick-reference matrix, verification notes and open questions Q1-Q5. Verified
  against Pilot main fabda0cb and read-only live checks.
- Developer guide §7.9 (issue 5, no API change, no §13 line): resolution fields
  country/note/contact, the four step-5 notes, when a row is case by case, and
  live examples; Word and PDF rebuilt with build.sh (OpenAPI/Postman unchanged).
- WEBSITE-DEVELOPER-REQUIREMENTS.md v2.3: R19 returned, R12 points to it.
- docs/README.md: router row for the role guides.

Co-Authored-By: Claude Opus 5.5 <noreply@anthropic.com>
Claude-Session: https://claude.ai/code/session_01RnriTf32Hcv4Xqnq2DF1qq
</commit_message>
<xml_diff>
--- a/docs/integrations/developer-pack/StudySearch-Website-API-v2-Developer-Guide.docx
+++ b/docs/integrations/developer-pack/StudySearch-Website-API-v2-Developer-Guide.docx
@@ -12767,88 +12767,34 @@
               <w:rPr>
                 <w:rStyle w:val="VerbatimChar"/>
               </w:rPr>
-              <w:t xml:space="preserve">step</w:t>
-            </w:r>
-            <w:r>
-              <w:t xml:space="preserve">,</w:t>
-            </w:r>
-            <w:r>
-              <w:t xml:space="preserve"> </w:t>
-            </w:r>
-            <w:r>
-              <w:rPr>
-                <w:rStyle w:val="VerbatimChar"/>
-              </w:rPr>
-              <w:t xml:space="preserve">rule</w:t>
-            </w:r>
-          </w:p>
-        </w:tc>
-        <w:tc>
-          <w:tcPr/>
-          <w:p>
-            <w:pPr>
-              <w:pStyle w:val="Compact"/>
-              <w:jc w:val="left"/>
-            </w:pPr>
-            <w:r>
-              <w:t xml:space="preserve">1–5:</w:t>
-            </w:r>
-            <w:r>
-              <w:t xml:space="preserve"> </w:t>
-            </w:r>
-            <w:r>
-              <w:rPr>
-                <w:rStyle w:val="VerbatimChar"/>
-              </w:rPr>
-              <w:t xml:space="preserve">course_override</w:t>
-            </w:r>
-            <w:r>
-              <w:t xml:space="preserve">,</w:t>
-            </w:r>
-            <w:r>
-              <w:t xml:space="preserve"> </w:t>
-            </w:r>
-            <w:r>
-              <w:rPr>
-                <w:rStyle w:val="VerbatimChar"/>
-              </w:rPr>
-              <w:t xml:space="preserve">course_country_row</w:t>
-            </w:r>
-            <w:r>
-              <w:t xml:space="preserve">,</w:t>
-            </w:r>
-            <w:r>
-              <w:t xml:space="preserve"> </w:t>
-            </w:r>
-            <w:r>
-              <w:rPr>
-                <w:rStyle w:val="VerbatimChar"/>
-              </w:rPr>
-              <w:t xml:space="preserve">band_ladder</w:t>
-            </w:r>
-            <w:r>
-              <w:t xml:space="preserve">,</w:t>
-            </w:r>
-            <w:r>
-              <w:t xml:space="preserve"> </w:t>
-            </w:r>
-            <w:r>
-              <w:rPr>
-                <w:rStyle w:val="VerbatimChar"/>
-              </w:rPr>
-              <w:t xml:space="preserve">provider_minimum</w:t>
-            </w:r>
-            <w:r>
-              <w:t xml:space="preserve">,</w:t>
-            </w:r>
-            <w:r>
-              <w:t xml:space="preserve"> </w:t>
-            </w:r>
-            <w:r>
-              <w:rPr>
-                <w:rStyle w:val="VerbatimChar"/>
-              </w:rPr>
-              <w:t xml:space="preserve">contact_provider</w:t>
+              <w:t xml:space="preserve">country</w:t>
+            </w:r>
+          </w:p>
+        </w:tc>
+        <w:tc>
+          <w:tcPr/>
+          <w:p>
+            <w:pPr>
+              <w:pStyle w:val="Compact"/>
+              <w:jc w:val="left"/>
+            </w:pPr>
+            <w:r>
+              <w:t xml:space="preserve">The</w:t>
+            </w:r>
+            <w:r>
+              <w:t xml:space="preserve"> </w:t>
+            </w:r>
+            <w:r>
+              <w:rPr>
+                <w:rStyle w:val="VerbatimChar"/>
+              </w:rPr>
+              <w:t xml:space="preserve">edu_country</w:t>
+            </w:r>
+            <w:r>
+              <w:t xml:space="preserve"> </w:t>
+            </w:r>
+            <w:r>
+              <w:t xml:space="preserve">you sent, in capitals</w:t>
             </w:r>
           </w:p>
         </w:tc>
@@ -12865,22 +12811,7 @@
               <w:rPr>
                 <w:rStyle w:val="VerbatimChar"/>
               </w:rPr>
-              <w:t xml:space="preserve">outcome</w:t>
-            </w:r>
-          </w:p>
-        </w:tc>
-        <w:tc>
-          <w:tcPr/>
-          <w:p>
-            <w:pPr>
-              <w:pStyle w:val="Compact"/>
-              <w:jc w:val="left"/>
-            </w:pPr>
-            <w:r>
-              <w:rPr>
-                <w:rStyle w:val="VerbatimChar"/>
-              </w:rPr>
-              <w:t xml:space="preserve">minimum_published</w:t>
+              <w:t xml:space="preserve">step</w:t>
             </w:r>
             <w:r>
               <w:t xml:space="preserve">,</w:t>
@@ -12892,13 +12823,67 @@
               <w:rPr>
                 <w:rStyle w:val="VerbatimChar"/>
               </w:rPr>
-              <w:t xml:space="preserve">case_by_case</w:t>
-            </w:r>
-            <w:r>
-              <w:t xml:space="preserve"> </w:t>
-            </w:r>
-            <w:r>
-              <w:t xml:space="preserve">or</w:t>
+              <w:t xml:space="preserve">rule</w:t>
+            </w:r>
+          </w:p>
+        </w:tc>
+        <w:tc>
+          <w:tcPr/>
+          <w:p>
+            <w:pPr>
+              <w:pStyle w:val="Compact"/>
+              <w:jc w:val="left"/>
+            </w:pPr>
+            <w:r>
+              <w:t xml:space="preserve">1–5:</w:t>
+            </w:r>
+            <w:r>
+              <w:t xml:space="preserve"> </w:t>
+            </w:r>
+            <w:r>
+              <w:rPr>
+                <w:rStyle w:val="VerbatimChar"/>
+              </w:rPr>
+              <w:t xml:space="preserve">course_override</w:t>
+            </w:r>
+            <w:r>
+              <w:t xml:space="preserve">,</w:t>
+            </w:r>
+            <w:r>
+              <w:t xml:space="preserve"> </w:t>
+            </w:r>
+            <w:r>
+              <w:rPr>
+                <w:rStyle w:val="VerbatimChar"/>
+              </w:rPr>
+              <w:t xml:space="preserve">course_country_row</w:t>
+            </w:r>
+            <w:r>
+              <w:t xml:space="preserve">,</w:t>
+            </w:r>
+            <w:r>
+              <w:t xml:space="preserve"> </w:t>
+            </w:r>
+            <w:r>
+              <w:rPr>
+                <w:rStyle w:val="VerbatimChar"/>
+              </w:rPr>
+              <w:t xml:space="preserve">band_ladder</w:t>
+            </w:r>
+            <w:r>
+              <w:t xml:space="preserve">,</w:t>
+            </w:r>
+            <w:r>
+              <w:t xml:space="preserve"> </w:t>
+            </w:r>
+            <w:r>
+              <w:rPr>
+                <w:rStyle w:val="VerbatimChar"/>
+              </w:rPr>
+              <w:t xml:space="preserve">provider_minimum</w:t>
+            </w:r>
+            <w:r>
+              <w:t xml:space="preserve">,</w:t>
             </w:r>
             <w:r>
               <w:t xml:space="preserve"> </w:t>
@@ -12924,22 +12909,22 @@
               <w:rPr>
                 <w:rStyle w:val="VerbatimChar"/>
               </w:rPr>
-              <w:t xml:space="preserve">rows[]</w:t>
-            </w:r>
-          </w:p>
-        </w:tc>
-        <w:tc>
-          <w:tcPr/>
-          <w:p>
-            <w:pPr>
-              <w:pStyle w:val="Compact"/>
-              <w:jc w:val="left"/>
-            </w:pPr>
-            <w:r>
-              <w:rPr>
-                <w:rStyle w:val="VerbatimChar"/>
-              </w:rPr>
-              <w:t xml:space="preserve">qualification</w:t>
+              <w:t xml:space="preserve">outcome</w:t>
+            </w:r>
+          </w:p>
+        </w:tc>
+        <w:tc>
+          <w:tcPr/>
+          <w:p>
+            <w:pPr>
+              <w:pStyle w:val="Compact"/>
+              <w:jc w:val="left"/>
+            </w:pPr>
+            <w:r>
+              <w:rPr>
+                <w:rStyle w:val="VerbatimChar"/>
+              </w:rPr>
+              <w:t xml:space="preserve">minimum_published</w:t>
             </w:r>
             <w:r>
               <w:t xml:space="preserve">,</w:t>
@@ -12951,103 +12936,22 @@
               <w:rPr>
                 <w:rStyle w:val="VerbatimChar"/>
               </w:rPr>
-              <w:t xml:space="preserve">study_level</w:t>
-            </w:r>
-            <w:r>
-              <w:t xml:space="preserve">,</w:t>
-            </w:r>
-            <w:r>
-              <w:t xml:space="preserve"> </w:t>
-            </w:r>
-            <w:r>
-              <w:rPr>
-                <w:rStyle w:val="VerbatimChar"/>
-              </w:rPr>
-              <w:t xml:space="preserve">min_grade</w:t>
-            </w:r>
-            <w:r>
-              <w:t xml:space="preserve">,</w:t>
-            </w:r>
-            <w:r>
-              <w:t xml:space="preserve"> </w:t>
-            </w:r>
-            <w:r>
-              <w:rPr>
-                <w:rStyle w:val="VerbatimChar"/>
-              </w:rPr>
-              <w:t xml:space="preserve">scale</w:t>
-            </w:r>
-            <w:r>
-              <w:t xml:space="preserve">,</w:t>
-            </w:r>
-            <w:r>
-              <w:t xml:space="preserve"> </w:t>
-            </w:r>
-            <w:r>
-              <w:rPr>
-                <w:rStyle w:val="VerbatimChar"/>
-              </w:rPr>
-              <w:t xml:space="preserve">band</w:t>
-            </w:r>
-            <w:r>
-              <w:t xml:space="preserve">,</w:t>
-            </w:r>
-            <w:r>
-              <w:t xml:space="preserve"> </w:t>
-            </w:r>
-            <w:r>
-              <w:rPr>
-                <w:rStyle w:val="VerbatimChar"/>
-              </w:rPr>
-              <w:t xml:space="preserve">conditions</w:t>
-            </w:r>
-            <w:r>
-              <w:t xml:space="preserve">,</w:t>
-            </w:r>
-            <w:r>
-              <w:t xml:space="preserve"> </w:t>
-            </w:r>
-            <w:r>
-              <w:rPr>
-                <w:rStyle w:val="VerbatimChar"/>
-              </w:rPr>
-              <w:t xml:space="preserve">quote</w:t>
-            </w:r>
-            <w:r>
-              <w:t xml:space="preserve">,</w:t>
-            </w:r>
-            <w:r>
-              <w:t xml:space="preserve"> </w:t>
-            </w:r>
-            <w:r>
-              <w:rPr>
-                <w:rStyle w:val="VerbatimChar"/>
-              </w:rPr>
-              <w:t xml:space="preserve">as_at</w:t>
-            </w:r>
-            <w:r>
-              <w:t xml:space="preserve">,</w:t>
-            </w:r>
-            <w:r>
-              <w:t xml:space="preserve"> </w:t>
-            </w:r>
-            <w:r>
-              <w:rPr>
-                <w:rStyle w:val="VerbatimChar"/>
-              </w:rPr>
-              <w:t xml:space="preserve">edition</w:t>
-            </w:r>
-            <w:r>
-              <w:t xml:space="preserve">,</w:t>
-            </w:r>
-            <w:r>
-              <w:t xml:space="preserve"> </w:t>
-            </w:r>
-            <w:r>
-              <w:rPr>
-                <w:rStyle w:val="VerbatimChar"/>
-              </w:rPr>
               <w:t xml:space="preserve">case_by_case</w:t>
+            </w:r>
+            <w:r>
+              <w:t xml:space="preserve"> </w:t>
+            </w:r>
+            <w:r>
+              <w:t xml:space="preserve">or</w:t>
+            </w:r>
+            <w:r>
+              <w:t xml:space="preserve"> </w:t>
+            </w:r>
+            <w:r>
+              <w:rPr>
+                <w:rStyle w:val="VerbatimChar"/>
+              </w:rPr>
+              <w:t xml:space="preserve">contact_provider</w:t>
             </w:r>
           </w:p>
         </w:tc>
@@ -13064,6 +12968,146 @@
               <w:rPr>
                 <w:rStyle w:val="VerbatimChar"/>
               </w:rPr>
+              <w:t xml:space="preserve">rows[]</w:t>
+            </w:r>
+          </w:p>
+        </w:tc>
+        <w:tc>
+          <w:tcPr/>
+          <w:p>
+            <w:pPr>
+              <w:pStyle w:val="Compact"/>
+              <w:jc w:val="left"/>
+            </w:pPr>
+            <w:r>
+              <w:rPr>
+                <w:rStyle w:val="VerbatimChar"/>
+              </w:rPr>
+              <w:t xml:space="preserve">qualification</w:t>
+            </w:r>
+            <w:r>
+              <w:t xml:space="preserve">,</w:t>
+            </w:r>
+            <w:r>
+              <w:t xml:space="preserve"> </w:t>
+            </w:r>
+            <w:r>
+              <w:rPr>
+                <w:rStyle w:val="VerbatimChar"/>
+              </w:rPr>
+              <w:t xml:space="preserve">study_level</w:t>
+            </w:r>
+            <w:r>
+              <w:t xml:space="preserve">,</w:t>
+            </w:r>
+            <w:r>
+              <w:t xml:space="preserve"> </w:t>
+            </w:r>
+            <w:r>
+              <w:rPr>
+                <w:rStyle w:val="VerbatimChar"/>
+              </w:rPr>
+              <w:t xml:space="preserve">min_grade</w:t>
+            </w:r>
+            <w:r>
+              <w:t xml:space="preserve">,</w:t>
+            </w:r>
+            <w:r>
+              <w:t xml:space="preserve"> </w:t>
+            </w:r>
+            <w:r>
+              <w:rPr>
+                <w:rStyle w:val="VerbatimChar"/>
+              </w:rPr>
+              <w:t xml:space="preserve">scale</w:t>
+            </w:r>
+            <w:r>
+              <w:t xml:space="preserve">,</w:t>
+            </w:r>
+            <w:r>
+              <w:t xml:space="preserve"> </w:t>
+            </w:r>
+            <w:r>
+              <w:rPr>
+                <w:rStyle w:val="VerbatimChar"/>
+              </w:rPr>
+              <w:t xml:space="preserve">band</w:t>
+            </w:r>
+            <w:r>
+              <w:t xml:space="preserve">,</w:t>
+            </w:r>
+            <w:r>
+              <w:t xml:space="preserve"> </w:t>
+            </w:r>
+            <w:r>
+              <w:rPr>
+                <w:rStyle w:val="VerbatimChar"/>
+              </w:rPr>
+              <w:t xml:space="preserve">conditions</w:t>
+            </w:r>
+            <w:r>
+              <w:t xml:space="preserve">,</w:t>
+            </w:r>
+            <w:r>
+              <w:t xml:space="preserve"> </w:t>
+            </w:r>
+            <w:r>
+              <w:rPr>
+                <w:rStyle w:val="VerbatimChar"/>
+              </w:rPr>
+              <w:t xml:space="preserve">quote</w:t>
+            </w:r>
+            <w:r>
+              <w:t xml:space="preserve">,</w:t>
+            </w:r>
+            <w:r>
+              <w:t xml:space="preserve"> </w:t>
+            </w:r>
+            <w:r>
+              <w:rPr>
+                <w:rStyle w:val="VerbatimChar"/>
+              </w:rPr>
+              <w:t xml:space="preserve">as_at</w:t>
+            </w:r>
+            <w:r>
+              <w:t xml:space="preserve">,</w:t>
+            </w:r>
+            <w:r>
+              <w:t xml:space="preserve"> </w:t>
+            </w:r>
+            <w:r>
+              <w:rPr>
+                <w:rStyle w:val="VerbatimChar"/>
+              </w:rPr>
+              <w:t xml:space="preserve">edition</w:t>
+            </w:r>
+            <w:r>
+              <w:t xml:space="preserve">,</w:t>
+            </w:r>
+            <w:r>
+              <w:t xml:space="preserve"> </w:t>
+            </w:r>
+            <w:r>
+              <w:rPr>
+                <w:rStyle w:val="VerbatimChar"/>
+              </w:rPr>
+              <w:t xml:space="preserve">case_by_case</w:t>
+            </w:r>
+          </w:p>
+        </w:tc>
+      </w:tr>
+      <w:tr>
+        <w:tc>
+          <w:tcPr/>
+          <w:p>
+            <w:pPr>
+              <w:pStyle w:val="Compact"/>
+              <w:jc w:val="left"/>
+            </w:pPr>
+            <w:r>
+              <w:rPr>
+                <w:rStyle w:val="VerbatimChar"/>
+              </w:rPr>
               <w:t xml:space="preserve">note</w:t>
             </w:r>
           </w:p>
@@ -13091,7 +13135,165 @@
               <w:t xml:space="preserve"> </w:t>
             </w:r>
             <w:r>
-              <w:t xml:space="preserve">is 5</w:t>
+              <w:t xml:space="preserve">is 5. One of:</w:t>
+            </w:r>
+            <w:r>
+              <w:t xml:space="preserve"> </w:t>
+            </w:r>
+            <w:r>
+              <w:t xml:space="preserve">“</w:t>
+            </w:r>
+            <w:r>
+              <w:t xml:space="preserve">The provider publishes a band table for this country, but the course page prints no band to enter it with.</w:t>
+            </w:r>
+            <w:r>
+              <w:t xml:space="preserve">”</w:t>
+            </w:r>
+            <w:r>
+              <w:t xml:space="preserve">;</w:t>
+            </w:r>
+            <w:r>
+              <w:t xml:space="preserve"> </w:t>
+            </w:r>
+            <w:r>
+              <w:t xml:space="preserve">“</w:t>
+            </w:r>
+            <w:r>
+              <w:t xml:space="preserve">The course band … has no published row for this country and level.</w:t>
+            </w:r>
+            <w:r>
+              <w:t xml:space="preserve">”</w:t>
+            </w:r>
+            <w:r>
+              <w:t xml:space="preserve">;</w:t>
+            </w:r>
+            <w:r>
+              <w:t xml:space="preserve"> </w:t>
+            </w:r>
+            <w:r>
+              <w:t xml:space="preserve">“</w:t>
+            </w:r>
+            <w:r>
+              <w:t xml:space="preserve">The provider publishes rows for this country, none for this course’s level.</w:t>
+            </w:r>
+            <w:r>
+              <w:t xml:space="preserve">”</w:t>
+            </w:r>
+            <w:r>
+              <w:t xml:space="preserve">;</w:t>
+            </w:r>
+            <w:r>
+              <w:t xml:space="preserve"> </w:t>
+            </w:r>
+            <w:r>
+              <w:t xml:space="preserve">“</w:t>
+            </w:r>
+            <w:r>
+              <w:t xml:space="preserve">No published requirement for this country.</w:t>
+            </w:r>
+            <w:r>
+              <w:t xml:space="preserve">”</w:t>
+            </w:r>
+            <w:r>
+              <w:t xml:space="preserve"> </w:t>
+            </w:r>
+            <w:r>
+              <w:t xml:space="preserve">You may show it under the</w:t>
+            </w:r>
+            <w:r>
+              <w:t xml:space="preserve"> </w:t>
+            </w:r>
+            <w:r>
+              <w:t xml:space="preserve">“</w:t>
+            </w:r>
+            <w:r>
+              <w:t xml:space="preserve">contact the provider</w:t>
+            </w:r>
+            <w:r>
+              <w:t xml:space="preserve">”</w:t>
+            </w:r>
+            <w:r>
+              <w:t xml:space="preserve"> </w:t>
+            </w:r>
+            <w:r>
+              <w:t xml:space="preserve">message</w:t>
+            </w:r>
+          </w:p>
+        </w:tc>
+      </w:tr>
+      <w:tr>
+        <w:tc>
+          <w:tcPr/>
+          <w:p>
+            <w:pPr>
+              <w:pStyle w:val="Compact"/>
+              <w:jc w:val="left"/>
+            </w:pPr>
+            <w:r>
+              <w:rPr>
+                <w:rStyle w:val="VerbatimChar"/>
+              </w:rPr>
+              <w:t xml:space="preserve">contact</w:t>
+            </w:r>
+          </w:p>
+        </w:tc>
+        <w:tc>
+          <w:tcPr/>
+          <w:p>
+            <w:pPr>
+              <w:pStyle w:val="Compact"/>
+              <w:jc w:val="left"/>
+            </w:pPr>
+            <w:r>
+              <w:t xml:space="preserve">When</w:t>
+            </w:r>
+            <w:r>
+              <w:t xml:space="preserve"> </w:t>
+            </w:r>
+            <w:r>
+              <w:rPr>
+                <w:rStyle w:val="VerbatimChar"/>
+              </w:rPr>
+              <w:t xml:space="preserve">step</w:t>
+            </w:r>
+            <w:r>
+              <w:t xml:space="preserve"> </w:t>
+            </w:r>
+            <w:r>
+              <w:t xml:space="preserve">is 5: the provider’s website, for the</w:t>
+            </w:r>
+            <w:r>
+              <w:t xml:space="preserve"> </w:t>
+            </w:r>
+            <w:r>
+              <w:t xml:space="preserve">“</w:t>
+            </w:r>
+            <w:r>
+              <w:t xml:space="preserve">contact the provider</w:t>
+            </w:r>
+            <w:r>
+              <w:t xml:space="preserve">”</w:t>
+            </w:r>
+            <w:r>
+              <w:t xml:space="preserve"> </w:t>
+            </w:r>
+            <w:r>
+              <w:t xml:space="preserve">link.</w:t>
+            </w:r>
+            <w:r>
+              <w:t xml:space="preserve"> </w:t>
+            </w:r>
+            <w:r>
+              <w:rPr>
+                <w:rStyle w:val="VerbatimChar"/>
+              </w:rPr>
+              <w:t xml:space="preserve">null</w:t>
+            </w:r>
+            <w:r>
+              <w:t xml:space="preserve"> </w:t>
+            </w:r>
+            <w:r>
+              <w:t xml:space="preserve">when not held</w:t>
             </w:r>
           </w:p>
         </w:tc>
@@ -13224,7 +13426,94 @@
         <w:t xml:space="preserve">”</w:t>
       </w:r>
       <w:r>
-        <w:t xml:space="preserve">, and never treat it as met.</w:t>
+        <w:t xml:space="preserve">, and never treat it as met. A row is</w:t>
+      </w:r>
+      <w:r>
+        <w:t xml:space="preserve"> </w:t>
+      </w:r>
+      <w:r>
+        <w:rPr>
+          <w:rStyle w:val="VerbatimChar"/>
+        </w:rPr>
+        <w:t xml:space="preserve">case_by_case</w:t>
+      </w:r>
+      <w:r>
+        <w:t xml:space="preserve"> </w:t>
+      </w:r>
+      <w:r>
+        <w:t xml:space="preserve">when it states no minimum on a scale:</w:t>
+      </w:r>
+      <w:r>
+        <w:t xml:space="preserve"> </w:t>
+      </w:r>
+      <w:r>
+        <w:rPr>
+          <w:rStyle w:val="VerbatimChar"/>
+        </w:rPr>
+        <w:t xml:space="preserve">min_grade</w:t>
+      </w:r>
+      <w:r>
+        <w:t xml:space="preserve"> </w:t>
+      </w:r>
+      <w:r>
+        <w:t xml:space="preserve">is null, or</w:t>
+      </w:r>
+      <w:r>
+        <w:t xml:space="preserve"> </w:t>
+      </w:r>
+      <w:r>
+        <w:rPr>
+          <w:rStyle w:val="VerbatimChar"/>
+        </w:rPr>
+        <w:t xml:space="preserve">scale</w:t>
+      </w:r>
+      <w:r>
+        <w:t xml:space="preserve"> </w:t>
+      </w:r>
+      <w:r>
+        <w:t xml:space="preserve">is</w:t>
+      </w:r>
+      <w:r>
+        <w:t xml:space="preserve"> </w:t>
+      </w:r>
+      <w:r>
+        <w:rPr>
+          <w:rStyle w:val="VerbatimChar"/>
+        </w:rPr>
+        <w:t xml:space="preserve">"none"</w:t>
+      </w:r>
+      <w:r>
+        <w:t xml:space="preserve">. Where</w:t>
+      </w:r>
+      <w:r>
+        <w:t xml:space="preserve"> </w:t>
+      </w:r>
+      <w:r>
+        <w:rPr>
+          <w:rStyle w:val="VerbatimChar"/>
+        </w:rPr>
+        <w:t xml:space="preserve">min_grade</w:t>
+      </w:r>
+      <w:r>
+        <w:t xml:space="preserve"> </w:t>
+      </w:r>
+      <w:r>
+        <w:t xml:space="preserve">holds the provider’s words (for example</w:t>
+      </w:r>
+      <w:r>
+        <w:t xml:space="preserve"> </w:t>
+      </w:r>
+      <w:r>
+        <w:t xml:space="preserve">“</w:t>
+      </w:r>
+      <w:r>
+        <w:t xml:space="preserve">Completion of Senior High School Diploma</w:t>
+      </w:r>
+      <w:r>
+        <w:t xml:space="preserve">”</w:t>
+      </w:r>
+      <w:r>
+        <w:t xml:space="preserve">), show them as printed with the case-by-case message.</w:t>
       </w:r>
     </w:p>
     <w:p>
@@ -13451,7 +13740,31 @@
         <w:t xml:space="preserve">as_at</w:t>
       </w:r>
       <w:r>
-        <w:t xml:space="preserve">. A row with</w:t>
+        <w:t xml:space="preserve">.</w:t>
+      </w:r>
+      <w:r>
+        <w:t xml:space="preserve"> </w:t>
+      </w:r>
+      <w:r>
+        <w:rPr>
+          <w:rStyle w:val="VerbatimChar"/>
+        </w:rPr>
+        <w:t xml:space="preserve">scale</w:t>
+      </w:r>
+      <w:r>
+        <w:t xml:space="preserve"> </w:t>
+      </w:r>
+      <w:r>
+        <w:rPr>
+          <w:rStyle w:val="VerbatimChar"/>
+        </w:rPr>
+        <w:t xml:space="preserve">"none"</w:t>
+      </w:r>
+      <w:r>
+        <w:t xml:space="preserve"> </w:t>
+      </w:r>
+      <w:r>
+        <w:t xml:space="preserve">means the row states no minimum on a scale: show</w:t>
       </w:r>
       <w:r>
         <w:t xml:space="preserve"> </w:t>
@@ -13466,7 +13779,55 @@
         <w:t xml:space="preserve"> </w:t>
       </w:r>
       <w:r>
-        <w:t xml:space="preserve">null has</w:t>
+        <w:t xml:space="preserve">as printed, when present, with</w:t>
+      </w:r>
+      <w:r>
+        <w:t xml:space="preserve"> </w:t>
+      </w:r>
+      <w:r>
+        <w:t xml:space="preserve">“</w:t>
+      </w:r>
+      <w:r>
+        <w:t xml:space="preserve">This qualification is considered case by case</w:t>
+      </w:r>
+      <w:r>
+        <w:t xml:space="preserve">”</w:t>
+      </w:r>
+      <w:r>
+        <w:t xml:space="preserve"> </w:t>
+      </w:r>
+      <w:r>
+        <w:t xml:space="preserve">(the same rule as</w:t>
+      </w:r>
+      <w:r>
+        <w:t xml:space="preserve"> </w:t>
+      </w:r>
+      <w:r>
+        <w:rPr>
+          <w:rStyle w:val="VerbatimChar"/>
+        </w:rPr>
+        <w:t xml:space="preserve">case_by_case</w:t>
+      </w:r>
+      <w:r>
+        <w:t xml:space="preserve"> </w:t>
+      </w:r>
+      <w:r>
+        <w:t xml:space="preserve">above). A row with</w:t>
+      </w:r>
+      <w:r>
+        <w:t xml:space="preserve"> </w:t>
+      </w:r>
+      <w:r>
+        <w:rPr>
+          <w:rStyle w:val="VerbatimChar"/>
+        </w:rPr>
+        <w:t xml:space="preserve">min_grade</w:t>
+      </w:r>
+      <w:r>
+        <w:t xml:space="preserve"> </w:t>
+      </w:r>
+      <w:r>
+        <w:t xml:space="preserve">null always has</w:t>
       </w:r>
       <w:r>
         <w:t xml:space="preserve"> </w:t>
@@ -13487,7 +13848,7 @@
         <w:t xml:space="preserve">"none"</w:t>
       </w:r>
       <w:r>
-        <w:t xml:space="preserve">: it is considered case by case.</w:t>
+        <w:t xml:space="preserve">.</w:t>
       </w:r>
     </w:p>
     <w:p>
@@ -15262,11 +15623,897 @@
         <w:pStyle w:val="BodyText"/>
       </w:pPr>
       <w:r>
+        <w:t xml:space="preserve">A provider row with no minimum on a scale (same provider, measured 29 October 2026):</w:t>
+      </w:r>
+    </w:p>
+    <w:p>
+      <w:pPr>
+        <w:pStyle w:val="SourceCode"/>
+      </w:pPr>
+      <w:r>
+        <w:rPr>
+          <w:rStyle w:val="FunctionTok"/>
+        </w:rPr>
+        <w:t xml:space="preserve">{</w:t>
+      </w:r>
+      <w:r>
+        <w:rPr>
+          <w:rStyle w:val="NormalTok"/>
+        </w:rPr>
+        <w:t xml:space="preserve"> </w:t>
+      </w:r>
+      <w:r>
+        <w:rPr>
+          <w:rStyle w:val="DataTypeTok"/>
+        </w:rPr>
+        <w:t xml:space="preserve">"country"</w:t>
+      </w:r>
+      <w:r>
+        <w:rPr>
+          <w:rStyle w:val="FunctionTok"/>
+        </w:rPr>
+        <w:t xml:space="preserve">:</w:t>
+      </w:r>
+      <w:r>
+        <w:rPr>
+          <w:rStyle w:val="NormalTok"/>
+        </w:rPr>
+        <w:t xml:space="preserve"> </w:t>
+      </w:r>
+      <w:r>
+        <w:rPr>
+          <w:rStyle w:val="StringTok"/>
+        </w:rPr>
+        <w:t xml:space="preserve">"TW"</w:t>
+      </w:r>
+      <w:r>
+        <w:rPr>
+          <w:rStyle w:val="FunctionTok"/>
+        </w:rPr>
+        <w:t xml:space="preserve">,</w:t>
+      </w:r>
+      <w:r>
+        <w:rPr>
+          <w:rStyle w:val="NormalTok"/>
+        </w:rPr>
+        <w:t xml:space="preserve"> </w:t>
+      </w:r>
+      <w:r>
+        <w:rPr>
+          <w:rStyle w:val="DataTypeTok"/>
+        </w:rPr>
+        <w:t xml:space="preserve">"study_level"</w:t>
+      </w:r>
+      <w:r>
+        <w:rPr>
+          <w:rStyle w:val="FunctionTok"/>
+        </w:rPr>
+        <w:t xml:space="preserve">:</w:t>
+      </w:r>
+      <w:r>
+        <w:rPr>
+          <w:rStyle w:val="NormalTok"/>
+        </w:rPr>
+        <w:t xml:space="preserve"> </w:t>
+      </w:r>
+      <w:r>
+        <w:rPr>
+          <w:rStyle w:val="StringTok"/>
+        </w:rPr>
+        <w:t xml:space="preserve">"Foundation Studies"</w:t>
+      </w:r>
+      <w:r>
+        <w:rPr>
+          <w:rStyle w:val="FunctionTok"/>
+        </w:rPr>
+        <w:t xml:space="preserve">,</w:t>
+      </w:r>
+      <w:r>
+        <w:rPr>
+          <w:rStyle w:val="NormalTok"/>
+        </w:rPr>
+        <w:t xml:space="preserve"> </w:t>
+      </w:r>
+      <w:r>
+        <w:rPr>
+          <w:rStyle w:val="DataTypeTok"/>
+        </w:rPr>
+        <w:t xml:space="preserve">"qualification"</w:t>
+      </w:r>
+      <w:r>
+        <w:rPr>
+          <w:rStyle w:val="FunctionTok"/>
+        </w:rPr>
+        <w:t xml:space="preserve">:</w:t>
+      </w:r>
+      <w:r>
+        <w:rPr>
+          <w:rStyle w:val="NormalTok"/>
+        </w:rPr>
+        <w:t xml:space="preserve"> </w:t>
+      </w:r>
+      <w:r>
+        <w:rPr>
+          <w:rStyle w:val="StringTok"/>
+        </w:rPr>
+        <w:t xml:space="preserve">"Senior High School Diploma"</w:t>
+      </w:r>
+      <w:r>
+        <w:rPr>
+          <w:rStyle w:val="FunctionTok"/>
+        </w:rPr>
+        <w:t xml:space="preserve">,</w:t>
+      </w:r>
+      <w:r>
+        <w:br/>
+      </w:r>
+      <w:r>
+        <w:rPr>
+          <w:rStyle w:val="NormalTok"/>
+        </w:rPr>
+        <w:t xml:space="preserve">  </w:t>
+      </w:r>
+      <w:r>
+        <w:rPr>
+          <w:rStyle w:val="DataTypeTok"/>
+        </w:rPr>
+        <w:t xml:space="preserve">"min_grade"</w:t>
+      </w:r>
+      <w:r>
+        <w:rPr>
+          <w:rStyle w:val="FunctionTok"/>
+        </w:rPr>
+        <w:t xml:space="preserve">:</w:t>
+      </w:r>
+      <w:r>
+        <w:rPr>
+          <w:rStyle w:val="NormalTok"/>
+        </w:rPr>
+        <w:t xml:space="preserve"> </w:t>
+      </w:r>
+      <w:r>
+        <w:rPr>
+          <w:rStyle w:val="StringTok"/>
+        </w:rPr>
+        <w:t xml:space="preserve">"Completion of Senior High School Diploma"</w:t>
+      </w:r>
+      <w:r>
+        <w:rPr>
+          <w:rStyle w:val="FunctionTok"/>
+        </w:rPr>
+        <w:t xml:space="preserve">,</w:t>
+      </w:r>
+      <w:r>
+        <w:rPr>
+          <w:rStyle w:val="NormalTok"/>
+        </w:rPr>
+        <w:t xml:space="preserve"> </w:t>
+      </w:r>
+      <w:r>
+        <w:rPr>
+          <w:rStyle w:val="DataTypeTok"/>
+        </w:rPr>
+        <w:t xml:space="preserve">"scale"</w:t>
+      </w:r>
+      <w:r>
+        <w:rPr>
+          <w:rStyle w:val="FunctionTok"/>
+        </w:rPr>
+        <w:t xml:space="preserve">:</w:t>
+      </w:r>
+      <w:r>
+        <w:rPr>
+          <w:rStyle w:val="NormalTok"/>
+        </w:rPr>
+        <w:t xml:space="preserve"> </w:t>
+      </w:r>
+      <w:r>
+        <w:rPr>
+          <w:rStyle w:val="StringTok"/>
+        </w:rPr>
+        <w:t xml:space="preserve">"none"</w:t>
+      </w:r>
+      <w:r>
+        <w:rPr>
+          <w:rStyle w:val="FunctionTok"/>
+        </w:rPr>
+        <w:t xml:space="preserve">,</w:t>
+      </w:r>
+      <w:r>
+        <w:rPr>
+          <w:rStyle w:val="NormalTok"/>
+        </w:rPr>
+        <w:t xml:space="preserve"> </w:t>
+      </w:r>
+      <w:r>
+        <w:rPr>
+          <w:rStyle w:val="DataTypeTok"/>
+        </w:rPr>
+        <w:t xml:space="preserve">"band"</w:t>
+      </w:r>
+      <w:r>
+        <w:rPr>
+          <w:rStyle w:val="FunctionTok"/>
+        </w:rPr>
+        <w:t xml:space="preserve">:</w:t>
+      </w:r>
+      <w:r>
+        <w:rPr>
+          <w:rStyle w:val="NormalTok"/>
+        </w:rPr>
+        <w:t xml:space="preserve"> </w:t>
+      </w:r>
+      <w:r>
+        <w:rPr>
+          <w:rStyle w:val="KeywordTok"/>
+        </w:rPr>
+        <w:t xml:space="preserve">null</w:t>
+      </w:r>
+      <w:r>
+        <w:rPr>
+          <w:rStyle w:val="FunctionTok"/>
+        </w:rPr>
+        <w:t xml:space="preserve">,</w:t>
+      </w:r>
+      <w:r>
+        <w:br/>
+      </w:r>
+      <w:r>
+        <w:rPr>
+          <w:rStyle w:val="NormalTok"/>
+        </w:rPr>
+        <w:t xml:space="preserve">  </w:t>
+      </w:r>
+      <w:r>
+        <w:rPr>
+          <w:rStyle w:val="DataTypeTok"/>
+        </w:rPr>
+        <w:t xml:space="preserve">"conditions"</w:t>
+      </w:r>
+      <w:r>
+        <w:rPr>
+          <w:rStyle w:val="FunctionTok"/>
+        </w:rPr>
+        <w:t xml:space="preserve">:</w:t>
+      </w:r>
+      <w:r>
+        <w:rPr>
+          <w:rStyle w:val="NormalTok"/>
+        </w:rPr>
+        <w:t xml:space="preserve"> </w:t>
+      </w:r>
+      <w:r>
+        <w:rPr>
+          <w:rStyle w:val="FunctionTok"/>
+        </w:rPr>
+        <w:t xml:space="preserve">{</w:t>
+      </w:r>
+      <w:r>
+        <w:rPr>
+          <w:rStyle w:val="NormalTok"/>
+        </w:rPr>
+        <w:t xml:space="preserve"> </w:t>
+      </w:r>
+      <w:r>
+        <w:rPr>
+          <w:rStyle w:val="DataTypeTok"/>
+        </w:rPr>
+        <w:t xml:space="preserve">"best_n"</w:t>
+      </w:r>
+      <w:r>
+        <w:rPr>
+          <w:rStyle w:val="FunctionTok"/>
+        </w:rPr>
+        <w:t xml:space="preserve">:</w:t>
+      </w:r>
+      <w:r>
+        <w:rPr>
+          <w:rStyle w:val="NormalTok"/>
+        </w:rPr>
+        <w:t xml:space="preserve"> </w:t>
+      </w:r>
+      <w:r>
+        <w:rPr>
+          <w:rStyle w:val="KeywordTok"/>
+        </w:rPr>
+        <w:t xml:space="preserve">null</w:t>
+      </w:r>
+      <w:r>
+        <w:rPr>
+          <w:rStyle w:val="FunctionTok"/>
+        </w:rPr>
+        <w:t xml:space="preserve">,</w:t>
+      </w:r>
+      <w:r>
+        <w:rPr>
+          <w:rStyle w:val="NormalTok"/>
+        </w:rPr>
+        <w:t xml:space="preserve"> </w:t>
+      </w:r>
+      <w:r>
+        <w:rPr>
+          <w:rStyle w:val="DataTypeTok"/>
+        </w:rPr>
+        <w:t xml:space="preserve">"alternatives"</w:t>
+      </w:r>
+      <w:r>
+        <w:rPr>
+          <w:rStyle w:val="FunctionTok"/>
+        </w:rPr>
+        <w:t xml:space="preserve">:</w:t>
+      </w:r>
+      <w:r>
+        <w:rPr>
+          <w:rStyle w:val="NormalTok"/>
+        </w:rPr>
+        <w:t xml:space="preserve"> </w:t>
+      </w:r>
+      <w:r>
+        <w:rPr>
+          <w:rStyle w:val="OtherTok"/>
+        </w:rPr>
+        <w:t xml:space="preserve">[]</w:t>
+      </w:r>
+      <w:r>
+        <w:rPr>
+          <w:rStyle w:val="FunctionTok"/>
+        </w:rPr>
+        <w:t xml:space="preserve">,</w:t>
+      </w:r>
+      <w:r>
+        <w:rPr>
+          <w:rStyle w:val="NormalTok"/>
+        </w:rPr>
+        <w:t xml:space="preserve"> </w:t>
+      </w:r>
+      <w:r>
+        <w:rPr>
+          <w:rStyle w:val="DataTypeTok"/>
+        </w:rPr>
+        <w:t xml:space="preserve">"subject_minimums"</w:t>
+      </w:r>
+      <w:r>
+        <w:rPr>
+          <w:rStyle w:val="FunctionTok"/>
+        </w:rPr>
+        <w:t xml:space="preserve">:</w:t>
+      </w:r>
+      <w:r>
+        <w:rPr>
+          <w:rStyle w:val="NormalTok"/>
+        </w:rPr>
+        <w:t xml:space="preserve"> </w:t>
+      </w:r>
+      <w:r>
+        <w:rPr>
+          <w:rStyle w:val="OtherTok"/>
+        </w:rPr>
+        <w:t xml:space="preserve">[]</w:t>
+      </w:r>
+      <w:r>
+        <w:rPr>
+          <w:rStyle w:val="NormalTok"/>
+        </w:rPr>
+        <w:t xml:space="preserve"> </w:t>
+      </w:r>
+      <w:r>
+        <w:rPr>
+          <w:rStyle w:val="FunctionTok"/>
+        </w:rPr>
+        <w:t xml:space="preserve">},</w:t>
+      </w:r>
+      <w:r>
+        <w:rPr>
+          <w:rStyle w:val="NormalTok"/>
+        </w:rPr>
+        <w:t xml:space="preserve"> </w:t>
+      </w:r>
+      <w:r>
+        <w:rPr>
+          <w:rStyle w:val="DataTypeTok"/>
+        </w:rPr>
+        <w:t xml:space="preserve">"as_at"</w:t>
+      </w:r>
+      <w:r>
+        <w:rPr>
+          <w:rStyle w:val="FunctionTok"/>
+        </w:rPr>
+        <w:t xml:space="preserve">:</w:t>
+      </w:r>
+      <w:r>
+        <w:rPr>
+          <w:rStyle w:val="NormalTok"/>
+        </w:rPr>
+        <w:t xml:space="preserve"> </w:t>
+      </w:r>
+      <w:r>
+        <w:rPr>
+          <w:rStyle w:val="StringTok"/>
+        </w:rPr>
+        <w:t xml:space="preserve">"2026-10-26"</w:t>
+      </w:r>
+      <w:r>
+        <w:rPr>
+          <w:rStyle w:val="NormalTok"/>
+        </w:rPr>
+        <w:t xml:space="preserve"> </w:t>
+      </w:r>
+      <w:r>
+        <w:rPr>
+          <w:rStyle w:val="FunctionTok"/>
+        </w:rPr>
+        <w:t xml:space="preserve">}</w:t>
+      </w:r>
+    </w:p>
+    <w:p>
+      <w:pPr>
+        <w:pStyle w:val="FirstParagraph"/>
+      </w:pPr>
+      <w:r>
+        <w:t xml:space="preserve">Show</w:t>
+      </w:r>
+      <w:r>
+        <w:t xml:space="preserve"> </w:t>
+      </w:r>
+      <w:r>
+        <w:t xml:space="preserve">“</w:t>
+      </w:r>
+      <w:r>
+        <w:t xml:space="preserve">Senior High School Diploma: Completion of Senior High School Diploma. This qualification is considered case by case.</w:t>
+      </w:r>
+      <w:r>
+        <w:t xml:space="preserve">”</w:t>
+      </w:r>
+    </w:p>
+    <w:p>
+      <w:pPr>
+        <w:pStyle w:val="BodyText"/>
+      </w:pPr>
+      <w:r>
+        <w:t xml:space="preserve">The same course without</w:t>
+      </w:r>
+      <w:r>
+        <w:t xml:space="preserve"> </w:t>
+      </w:r>
+      <w:r>
+        <w:rPr>
+          <w:rStyle w:val="VerbatimChar"/>
+        </w:rPr>
+        <w:t xml:space="preserve">edu_country</w:t>
+      </w:r>
+      <w:r>
+        <w:t xml:space="preserve"> </w:t>
+      </w:r>
+      <w:r>
+        <w:t xml:space="preserve">(its own published requirements; nothing is read from this course’s page yet, so every field is empty and there is no</w:t>
+      </w:r>
+      <w:r>
+        <w:t xml:space="preserve"> </w:t>
+      </w:r>
+      <w:r>
+        <w:rPr>
+          <w:rStyle w:val="VerbatimChar"/>
+        </w:rPr>
+        <w:t xml:space="preserve">resolution</w:t>
+      </w:r>
+      <w:r>
+        <w:t xml:space="preserve">):</w:t>
+      </w:r>
+    </w:p>
+    <w:p>
+      <w:pPr>
+        <w:pStyle w:val="SourceCode"/>
+      </w:pPr>
+      <w:r>
+        <w:rPr>
+          <w:rStyle w:val="ErrorTok"/>
+        </w:rPr>
+        <w:t xml:space="preserve">"entry":</w:t>
+      </w:r>
+      <w:r>
+        <w:rPr>
+          <w:rStyle w:val="NormalTok"/>
+        </w:rPr>
+        <w:t xml:space="preserve"> </w:t>
+      </w:r>
+      <w:r>
+        <w:rPr>
+          <w:rStyle w:val="FunctionTok"/>
+        </w:rPr>
+        <w:t xml:space="preserve">{</w:t>
+      </w:r>
+      <w:r>
+        <w:rPr>
+          <w:rStyle w:val="NormalTok"/>
+        </w:rPr>
+        <w:t xml:space="preserve"> </w:t>
+      </w:r>
+      <w:r>
+        <w:rPr>
+          <w:rStyle w:val="DataTypeTok"/>
+        </w:rPr>
+        <w:t xml:space="preserve">"min_score"</w:t>
+      </w:r>
+      <w:r>
+        <w:rPr>
+          <w:rStyle w:val="FunctionTok"/>
+        </w:rPr>
+        <w:t xml:space="preserve">:</w:t>
+      </w:r>
+      <w:r>
+        <w:rPr>
+          <w:rStyle w:val="NormalTok"/>
+        </w:rPr>
+        <w:t xml:space="preserve"> </w:t>
+      </w:r>
+      <w:r>
+        <w:rPr>
+          <w:rStyle w:val="KeywordTok"/>
+        </w:rPr>
+        <w:t xml:space="preserve">null</w:t>
+      </w:r>
+      <w:r>
+        <w:rPr>
+          <w:rStyle w:val="FunctionTok"/>
+        </w:rPr>
+        <w:t xml:space="preserve">,</w:t>
+      </w:r>
+      <w:r>
+        <w:rPr>
+          <w:rStyle w:val="NormalTok"/>
+        </w:rPr>
+        <w:t xml:space="preserve"> </w:t>
+      </w:r>
+      <w:r>
+        <w:rPr>
+          <w:rStyle w:val="DataTypeTok"/>
+        </w:rPr>
+        <w:t xml:space="preserve">"min_score_basis"</w:t>
+      </w:r>
+      <w:r>
+        <w:rPr>
+          <w:rStyle w:val="FunctionTok"/>
+        </w:rPr>
+        <w:t xml:space="preserve">:</w:t>
+      </w:r>
+      <w:r>
+        <w:rPr>
+          <w:rStyle w:val="NormalTok"/>
+        </w:rPr>
+        <w:t xml:space="preserve"> </w:t>
+      </w:r>
+      <w:r>
+        <w:rPr>
+          <w:rStyle w:val="KeywordTok"/>
+        </w:rPr>
+        <w:t xml:space="preserve">null</w:t>
+      </w:r>
+      <w:r>
+        <w:rPr>
+          <w:rStyle w:val="FunctionTok"/>
+        </w:rPr>
+        <w:t xml:space="preserve">,</w:t>
+      </w:r>
+      <w:r>
+        <w:rPr>
+          <w:rStyle w:val="NormalTok"/>
+        </w:rPr>
+        <w:t xml:space="preserve"> </w:t>
+      </w:r>
+      <w:r>
+        <w:rPr>
+          <w:rStyle w:val="DataTypeTok"/>
+        </w:rPr>
+        <w:t xml:space="preserve">"benchmark_band"</w:t>
+      </w:r>
+      <w:r>
+        <w:rPr>
+          <w:rStyle w:val="FunctionTok"/>
+        </w:rPr>
+        <w:t xml:space="preserve">:</w:t>
+      </w:r>
+      <w:r>
+        <w:rPr>
+          <w:rStyle w:val="NormalTok"/>
+        </w:rPr>
+        <w:t xml:space="preserve"> </w:t>
+      </w:r>
+      <w:r>
+        <w:rPr>
+          <w:rStyle w:val="KeywordTok"/>
+        </w:rPr>
+        <w:t xml:space="preserve">null</w:t>
+      </w:r>
+      <w:r>
+        <w:rPr>
+          <w:rStyle w:val="FunctionTok"/>
+        </w:rPr>
+        <w:t xml:space="preserve">,</w:t>
+      </w:r>
+      <w:r>
+        <w:br/>
+      </w:r>
+      <w:r>
+        <w:rPr>
+          <w:rStyle w:val="NormalTok"/>
+        </w:rPr>
+        <w:t xml:space="preserve">           </w:t>
+      </w:r>
+      <w:r>
+        <w:rPr>
+          <w:rStyle w:val="DataTypeTok"/>
+        </w:rPr>
+        <w:t xml:space="preserve">"prerequisites"</w:t>
+      </w:r>
+      <w:r>
+        <w:rPr>
+          <w:rStyle w:val="FunctionTok"/>
+        </w:rPr>
+        <w:t xml:space="preserve">:</w:t>
+      </w:r>
+      <w:r>
+        <w:rPr>
+          <w:rStyle w:val="NormalTok"/>
+        </w:rPr>
+        <w:t xml:space="preserve"> </w:t>
+      </w:r>
+      <w:r>
+        <w:rPr>
+          <w:rStyle w:val="OtherTok"/>
+        </w:rPr>
+        <w:t xml:space="preserve">[]</w:t>
+      </w:r>
+      <w:r>
+        <w:rPr>
+          <w:rStyle w:val="FunctionTok"/>
+        </w:rPr>
+        <w:t xml:space="preserve">,</w:t>
+      </w:r>
+      <w:r>
+        <w:rPr>
+          <w:rStyle w:val="NormalTok"/>
+        </w:rPr>
+        <w:t xml:space="preserve"> </w:t>
+      </w:r>
+      <w:r>
+        <w:rPr>
+          <w:rStyle w:val="DataTypeTok"/>
+        </w:rPr>
+        <w:t xml:space="preserve">"selection_tasks"</w:t>
+      </w:r>
+      <w:r>
+        <w:rPr>
+          <w:rStyle w:val="FunctionTok"/>
+        </w:rPr>
+        <w:t xml:space="preserve">:</w:t>
+      </w:r>
+      <w:r>
+        <w:rPr>
+          <w:rStyle w:val="NormalTok"/>
+        </w:rPr>
+        <w:t xml:space="preserve"> </w:t>
+      </w:r>
+      <w:r>
+        <w:rPr>
+          <w:rStyle w:val="OtherTok"/>
+        </w:rPr>
+        <w:t xml:space="preserve">[]</w:t>
+      </w:r>
+      <w:r>
+        <w:rPr>
+          <w:rStyle w:val="FunctionTok"/>
+        </w:rPr>
+        <w:t xml:space="preserve">,</w:t>
+      </w:r>
+      <w:r>
+        <w:rPr>
+          <w:rStyle w:val="NormalTok"/>
+        </w:rPr>
+        <w:t xml:space="preserve"> </w:t>
+      </w:r>
+      <w:r>
+        <w:rPr>
+          <w:rStyle w:val="DataTypeTok"/>
+        </w:rPr>
+        <w:t xml:space="preserve">"requirements_note"</w:t>
+      </w:r>
+      <w:r>
+        <w:rPr>
+          <w:rStyle w:val="FunctionTok"/>
+        </w:rPr>
+        <w:t xml:space="preserve">:</w:t>
+      </w:r>
+      <w:r>
+        <w:rPr>
+          <w:rStyle w:val="NormalTok"/>
+        </w:rPr>
+        <w:t xml:space="preserve"> </w:t>
+      </w:r>
+      <w:r>
+        <w:rPr>
+          <w:rStyle w:val="KeywordTok"/>
+        </w:rPr>
+        <w:t xml:space="preserve">null</w:t>
+      </w:r>
+      <w:r>
+        <w:rPr>
+          <w:rStyle w:val="FunctionTok"/>
+        </w:rPr>
+        <w:t xml:space="preserve">,</w:t>
+      </w:r>
+      <w:r>
+        <w:rPr>
+          <w:rStyle w:val="NormalTok"/>
+        </w:rPr>
+        <w:t xml:space="preserve"> </w:t>
+      </w:r>
+      <w:r>
+        <w:rPr>
+          <w:rStyle w:val="DataTypeTok"/>
+        </w:rPr>
+        <w:t xml:space="preserve">"resolution"</w:t>
+      </w:r>
+      <w:r>
+        <w:rPr>
+          <w:rStyle w:val="FunctionTok"/>
+        </w:rPr>
+        <w:t xml:space="preserve">:</w:t>
+      </w:r>
+      <w:r>
+        <w:rPr>
+          <w:rStyle w:val="NormalTok"/>
+        </w:rPr>
+        <w:t xml:space="preserve"> </w:t>
+      </w:r>
+      <w:r>
+        <w:rPr>
+          <w:rStyle w:val="KeywordTok"/>
+        </w:rPr>
+        <w:t xml:space="preserve">null</w:t>
+      </w:r>
+      <w:r>
+        <w:rPr>
+          <w:rStyle w:val="NormalTok"/>
+        </w:rPr>
+        <w:t xml:space="preserve"> </w:t>
+      </w:r>
+      <w:r>
+        <w:rPr>
+          <w:rStyle w:val="FunctionTok"/>
+        </w:rPr>
+        <w:t xml:space="preserve">}</w:t>
+      </w:r>
+    </w:p>
+    <w:p>
+      <w:pPr>
+        <w:pStyle w:val="FirstParagraph"/>
+      </w:pPr>
+      <w:r>
+        <w:t xml:space="preserve">For a country the provider publishes nothing for (for example</w:t>
+      </w:r>
+      <w:r>
+        <w:t xml:space="preserve"> </w:t>
+      </w:r>
+      <w:r>
+        <w:rPr>
+          <w:rStyle w:val="VerbatimChar"/>
+        </w:rPr>
+        <w:t xml:space="preserve">edu_country</w:t>
+      </w:r>
+      <w:r>
+        <w:t xml:space="preserve"> </w:t>
+      </w:r>
+      <w:r>
+        <w:rPr>
+          <w:rStyle w:val="VerbatimChar"/>
+        </w:rPr>
+        <w:t xml:space="preserve">"ZW"</w:t>
+      </w:r>
+      <w:r>
+        <w:t xml:space="preserve">),</w:t>
+      </w:r>
+      <w:r>
+        <w:t xml:space="preserve"> </w:t>
+      </w:r>
+      <w:r>
+        <w:rPr>
+          <w:rStyle w:val="VerbatimChar"/>
+        </w:rPr>
+        <w:t xml:space="preserve">resolution</w:t>
+      </w:r>
+      <w:r>
+        <w:t xml:space="preserve"> </w:t>
+      </w:r>
+      <w:r>
+        <w:t xml:space="preserve">is step 5 with</w:t>
+      </w:r>
+      <w:r>
+        <w:t xml:space="preserve"> </w:t>
+      </w:r>
+      <w:r>
+        <w:rPr>
+          <w:rStyle w:val="VerbatimChar"/>
+        </w:rPr>
+        <w:t xml:space="preserve">note</w:t>
+      </w:r>
+      <w:r>
+        <w:t xml:space="preserve"> </w:t>
+      </w:r>
+      <w:r>
+        <w:t xml:space="preserve">“</w:t>
+      </w:r>
+      <w:r>
+        <w:t xml:space="preserve">No published requirement for this country.</w:t>
+      </w:r>
+      <w:r>
+        <w:t xml:space="preserve">”</w:t>
+      </w:r>
+      <w:r>
+        <w:t xml:space="preserve"> </w:t>
+      </w:r>
+      <w:r>
+        <w:t xml:space="preserve">Render every step 5 the same way:</w:t>
+      </w:r>
+      <w:r>
+        <w:t xml:space="preserve"> </w:t>
+      </w:r>
+      <w:r>
+        <w:t xml:space="preserve">“</w:t>
+      </w:r>
+      <w:r>
+        <w:t xml:space="preserve">contact the provider</w:t>
+      </w:r>
+      <w:r>
+        <w:t xml:space="preserve">”</w:t>
+      </w:r>
+      <w:r>
+        <w:t xml:space="preserve">, with</w:t>
+      </w:r>
+      <w:r>
+        <w:t xml:space="preserve"> </w:t>
+      </w:r>
+      <w:r>
+        <w:rPr>
+          <w:rStyle w:val="VerbatimChar"/>
+        </w:rPr>
+        <w:t xml:space="preserve">contact</w:t>
+      </w:r>
+      <w:r>
+        <w:t xml:space="preserve">.</w:t>
+      </w:r>
+    </w:p>
+    <w:p>
+      <w:pPr>
+        <w:pStyle w:val="BodyText"/>
+      </w:pPr>
+      <w:r>
         <w:rPr>
           <w:bCs/>
           <w:b/>
         </w:rPr>
         <w:t xml:space="preserve">Integrating:</w:t>
+      </w:r>
+    </w:p>
+    <w:p>
+      <w:pPr>
+        <w:numPr>
+          <w:ilvl w:val="0"/>
+          <w:numId w:val="1013"/>
+        </w:numPr>
+        <w:pStyle w:val="Compact"/>
+      </w:pPr>
+      <w:r>
+        <w:rPr>
+          <w:bCs/>
+          <w:b/>
+        </w:rPr>
+        <w:t xml:space="preserve">What the website shows is built by the website team.</w:t>
+      </w:r>
+      <w:r>
+        <w:t xml:space="preserve"> </w:t>
+      </w:r>
+      <w:r>
+        <w:t xml:space="preserve">The API returns the data and the outcome words above; it does not provide page components.</w:t>
       </w:r>
     </w:p>
     <w:p>

</xml_diff>

<commit_message>
D3 and D4 verified live (v2.15.382); developer guide issue 7 rebuilt with live examples; D4 handover; register and INDEX current
Co-Authored-By: Claude Opus 5.5 <noreply@anthropic.com>
Claude-Session: https://claude.ai/code/session_01RnriTf32Hcv4Xqnq2DF1qq
</commit_message>
<xml_diff>
--- a/docs/integrations/developer-pack/StudySearch-Website-API-v2-Developer-Guide.docx
+++ b/docs/integrations/developer-pack/StudySearch-Website-API-v2-Developer-Guide.docx
@@ -87,7 +87,7 @@
         <w:t xml:space="preserve"> </w:t>
       </w:r>
       <w:r>
-        <w:t xml:space="preserve">6</w:t>
+        <w:t xml:space="preserve">7</w:t>
       </w:r>
       <w:r>
         <w:t xml:space="preserve"> </w:t>
@@ -12478,6 +12478,161 @@
               <w:rPr>
                 <w:rStyle w:val="VerbatimChar"/>
               </w:rPr>
+              <w:t xml:space="preserve">min_scores[]</w:t>
+            </w:r>
+          </w:p>
+        </w:tc>
+        <w:tc>
+          <w:tcPr/>
+          <w:p>
+            <w:pPr>
+              <w:pStyle w:val="Compact"/>
+              <w:jc w:val="left"/>
+            </w:pPr>
+            <w:r>
+              <w:t xml:space="preserve">Every entry score the course publishes, one item per route, as printed:</w:t>
+            </w:r>
+            <w:r>
+              <w:t xml:space="preserve"> </w:t>
+            </w:r>
+            <w:r>
+              <w:rPr>
+                <w:rStyle w:val="VerbatimChar"/>
+              </w:rPr>
+              <w:t xml:space="preserve">{ score, basis, audience, scale, quote, source_url, as_at }</w:t>
+            </w:r>
+            <w:r>
+              <w:t xml:space="preserve">.</w:t>
+            </w:r>
+            <w:r>
+              <w:t xml:space="preserve"> </w:t>
+            </w:r>
+            <w:r>
+              <w:rPr>
+                <w:rStyle w:val="VerbatimChar"/>
+              </w:rPr>
+              <w:t xml:space="preserve">audience</w:t>
+            </w:r>
+            <w:r>
+              <w:t xml:space="preserve"> </w:t>
+            </w:r>
+            <w:r>
+              <w:t xml:space="preserve">is</w:t>
+            </w:r>
+            <w:r>
+              <w:t xml:space="preserve"> </w:t>
+            </w:r>
+            <w:r>
+              <w:rPr>
+                <w:rStyle w:val="VerbatimChar"/>
+              </w:rPr>
+              <w:t xml:space="preserve">international</w:t>
+            </w:r>
+            <w:r>
+              <w:t xml:space="preserve">,</w:t>
+            </w:r>
+            <w:r>
+              <w:t xml:space="preserve"> </w:t>
+            </w:r>
+            <w:r>
+              <w:rPr>
+                <w:rStyle w:val="VerbatimChar"/>
+              </w:rPr>
+              <w:t xml:space="preserve">all</w:t>
+            </w:r>
+            <w:r>
+              <w:t xml:space="preserve"> </w:t>
+            </w:r>
+            <w:r>
+              <w:t xml:space="preserve">or</w:t>
+            </w:r>
+            <w:r>
+              <w:t xml:space="preserve"> </w:t>
+            </w:r>
+            <w:r>
+              <w:rPr>
+                <w:rStyle w:val="VerbatimChar"/>
+              </w:rPr>
+              <w:t xml:space="preserve">domestic</w:t>
+            </w:r>
+            <w:r>
+              <w:t xml:space="preserve">;</w:t>
+            </w:r>
+            <w:r>
+              <w:t xml:space="preserve"> </w:t>
+            </w:r>
+            <w:r>
+              <w:rPr>
+                <w:rStyle w:val="VerbatimChar"/>
+              </w:rPr>
+              <w:t xml:space="preserve">scale</w:t>
+            </w:r>
+            <w:r>
+              <w:t xml:space="preserve"> </w:t>
+            </w:r>
+            <w:r>
+              <w:t xml:space="preserve">is the grading scale only where the provider states one (otherwise</w:t>
+            </w:r>
+            <w:r>
+              <w:t xml:space="preserve"> </w:t>
+            </w:r>
+            <w:r>
+              <w:rPr>
+                <w:rStyle w:val="VerbatimChar"/>
+              </w:rPr>
+              <w:t xml:space="preserve">null</w:t>
+            </w:r>
+            <w:r>
+              <w:t xml:space="preserve">, never worked out). Order: international, all, domestic. Always present;</w:t>
+            </w:r>
+            <w:r>
+              <w:t xml:space="preserve"> </w:t>
+            </w:r>
+            <w:r>
+              <w:rPr>
+                <w:rStyle w:val="VerbatimChar"/>
+              </w:rPr>
+              <w:t xml:space="preserve">[]</w:t>
+            </w:r>
+            <w:r>
+              <w:t xml:space="preserve"> </w:t>
+            </w:r>
+            <w:r>
+              <w:t xml:space="preserve">when none is held. See</w:t>
+            </w:r>
+            <w:r>
+              <w:t xml:space="preserve"> </w:t>
+            </w:r>
+            <w:r>
+              <w:t xml:space="preserve">“</w:t>
+            </w:r>
+            <w:r>
+              <w:t xml:space="preserve">Several entry scores</w:t>
+            </w:r>
+            <w:r>
+              <w:t xml:space="preserve">”</w:t>
+            </w:r>
+            <w:r>
+              <w:t xml:space="preserve"> </w:t>
+            </w:r>
+            <w:r>
+              <w:t xml:space="preserve">below</w:t>
+            </w:r>
+          </w:p>
+        </w:tc>
+      </w:tr>
+      <w:tr>
+        <w:tc>
+          <w:tcPr/>
+          <w:p>
+            <w:pPr>
+              <w:pStyle w:val="Compact"/>
+              <w:jc w:val="left"/>
+            </w:pPr>
+            <w:r>
+              <w:rPr>
+                <w:rStyle w:val="VerbatimChar"/>
+              </w:rPr>
               <w:t xml:space="preserve">benchmark_band</w:t>
             </w:r>
           </w:p>
@@ -12625,14 +12780,46 @@
       </w:pPr>
       <w:r>
         <w:rPr>
+          <w:bCs/>
+          <w:b/>
+        </w:rPr>
+        <w:t xml:space="preserve">Several entry scores (</w:t>
+      </w:r>
+      <w:r>
+        <w:rPr>
           <w:rStyle w:val="VerbatimChar"/>
           <w:bCs/>
           <w:b/>
         </w:rPr>
-        <w:t xml:space="preserve">resolution</w:t>
-      </w:r>
-      <w:r>
-        <w:t xml:space="preserve">: the requirement that applies to a student from that country. It is worked out in a fixed order, and the first rule that applies is used:</w:t>
+        <w:t xml:space="preserve">min_scores[]</w:t>
+      </w:r>
+      <w:r>
+        <w:rPr>
+          <w:bCs/>
+          <w:b/>
+        </w:rPr>
+        <w:t xml:space="preserve">).</w:t>
+      </w:r>
+      <w:r>
+        <w:t xml:space="preserve"> </w:t>
+      </w:r>
+      <w:r>
+        <w:t xml:space="preserve">Some courses publish more than one way in, for example ATAR, International Baccalaureate, GCE A Level and pathway programmes.</w:t>
+      </w:r>
+      <w:r>
+        <w:t xml:space="preserve"> </w:t>
+      </w:r>
+      <w:r>
+        <w:rPr>
+          <w:rStyle w:val="VerbatimChar"/>
+        </w:rPr>
+        <w:t xml:space="preserve">min_scores[]</w:t>
+      </w:r>
+      <w:r>
+        <w:t xml:space="preserve"> </w:t>
+      </w:r>
+      <w:r>
+        <w:t xml:space="preserve">lists each one as the provider prints it.</w:t>
       </w:r>
     </w:p>
     <w:p>
@@ -12644,7 +12831,49 @@
         <w:pStyle w:val="Compact"/>
       </w:pPr>
       <w:r>
-        <w:t xml:space="preserve">a rule the course page states for itself;</w:t>
+        <w:t xml:space="preserve">Show them as a list headed</w:t>
+      </w:r>
+      <w:r>
+        <w:t xml:space="preserve"> </w:t>
+      </w:r>
+      <w:r>
+        <w:t xml:space="preserve">“</w:t>
+      </w:r>
+      <w:r>
+        <w:t xml:space="preserve">Entry scores published for this course</w:t>
+      </w:r>
+      <w:r>
+        <w:t xml:space="preserve">”</w:t>
+      </w:r>
+      <w:r>
+        <w:t xml:space="preserve">, one line per item, international first. Use the item’s</w:t>
+      </w:r>
+      <w:r>
+        <w:t xml:space="preserve"> </w:t>
+      </w:r>
+      <w:r>
+        <w:rPr>
+          <w:rStyle w:val="VerbatimChar"/>
+        </w:rPr>
+        <w:t xml:space="preserve">quote</w:t>
+      </w:r>
+      <w:r>
+        <w:t xml:space="preserve"> </w:t>
+      </w:r>
+      <w:r>
+        <w:t xml:space="preserve">as the line: it is the provider’s own words and always names the route (</w:t>
+      </w:r>
+      <w:r>
+        <w:rPr>
+          <w:rStyle w:val="VerbatimChar"/>
+        </w:rPr>
+        <w:t xml:space="preserve">basis</w:t>
+      </w:r>
+      <w:r>
+        <w:t xml:space="preserve"> </w:t>
+      </w:r>
+      <w:r>
+        <w:t xml:space="preserve">is a short label and may not).</w:t>
       </w:r>
     </w:p>
     <w:p>
@@ -12656,7 +12885,22 @@
         <w:pStyle w:val="Compact"/>
       </w:pPr>
       <w:r>
-        <w:t xml:space="preserve">the provider’s row for this course and country;</w:t>
+        <w:t xml:space="preserve">Never convert between routes, never present the list as</w:t>
+      </w:r>
+      <w:r>
+        <w:t xml:space="preserve"> </w:t>
+      </w:r>
+      <w:r>
+        <w:t xml:space="preserve">“</w:t>
+      </w:r>
+      <w:r>
+        <w:t xml:space="preserve">or equivalent</w:t>
+      </w:r>
+      <w:r>
+        <w:t xml:space="preserve">”</w:t>
+      </w:r>
+      <w:r>
+        <w:t xml:space="preserve">, and never compare it with the student’s results.</w:t>
       </w:r>
     </w:p>
     <w:p>
@@ -12668,26 +12912,988 @@
         <w:pStyle w:val="Compact"/>
       </w:pPr>
       <w:r>
-        <w:t xml:space="preserve">the course’s band, looked up in the provider’s table for the country;</w:t>
+        <w:rPr>
+          <w:rStyle w:val="VerbatimChar"/>
+        </w:rPr>
+        <w:t xml:space="preserve">min_score</w:t>
+      </w:r>
+      <w:r>
+        <w:t xml:space="preserve"> </w:t>
+      </w:r>
+      <w:r>
+        <w:t xml:space="preserve">and</w:t>
+      </w:r>
+      <w:r>
+        <w:t xml:space="preserve"> </w:t>
+      </w:r>
+      <w:r>
+        <w:rPr>
+          <w:rStyle w:val="VerbatimChar"/>
+        </w:rPr>
+        <w:t xml:space="preserve">min_score_basis</w:t>
+      </w:r>
+      <w:r>
+        <w:t xml:space="preserve"> </w:t>
+      </w:r>
+      <w:r>
+        <w:t xml:space="preserve">are unchanged: keep using them where you show a single score.</w:t>
+      </w:r>
+    </w:p>
+    <w:p>
+      <w:pPr>
+        <w:pStyle w:val="SourceCode"/>
+      </w:pPr>
+      <w:r>
+        <w:rPr>
+          <w:rStyle w:val="ErrorTok"/>
+        </w:rPr>
+        <w:t xml:space="preserve">"min_scores":</w:t>
+      </w:r>
+      <w:r>
+        <w:rPr>
+          <w:rStyle w:val="NormalTok"/>
+        </w:rPr>
+        <w:t xml:space="preserve"> </w:t>
+      </w:r>
+      <w:r>
+        <w:rPr>
+          <w:rStyle w:val="OtherTok"/>
+        </w:rPr>
+        <w:t xml:space="preserve">[</w:t>
+      </w:r>
+      <w:r>
+        <w:br/>
+      </w:r>
+      <w:r>
+        <w:rPr>
+          <w:rStyle w:val="NormalTok"/>
+        </w:rPr>
+        <w:t xml:space="preserve">  </w:t>
+      </w:r>
+      <w:r>
+        <w:rPr>
+          <w:rStyle w:val="FunctionTok"/>
+        </w:rPr>
+        <w:t xml:space="preserve">{</w:t>
+      </w:r>
+      <w:r>
+        <w:rPr>
+          <w:rStyle w:val="NormalTok"/>
+        </w:rPr>
+        <w:t xml:space="preserve"> </w:t>
+      </w:r>
+      <w:r>
+        <w:rPr>
+          <w:rStyle w:val="DataTypeTok"/>
+        </w:rPr>
+        <w:t xml:space="preserve">"score"</w:t>
+      </w:r>
+      <w:r>
+        <w:rPr>
+          <w:rStyle w:val="FunctionTok"/>
+        </w:rPr>
+        <w:t xml:space="preserve">:</w:t>
+      </w:r>
+      <w:r>
+        <w:rPr>
+          <w:rStyle w:val="NormalTok"/>
+        </w:rPr>
+        <w:t xml:space="preserve"> </w:t>
+      </w:r>
+      <w:r>
+        <w:rPr>
+          <w:rStyle w:val="DecValTok"/>
+        </w:rPr>
+        <w:t xml:space="preserve">26</w:t>
+      </w:r>
+      <w:r>
+        <w:rPr>
+          <w:rStyle w:val="FunctionTok"/>
+        </w:rPr>
+        <w:t xml:space="preserve">,</w:t>
+      </w:r>
+      <w:r>
+        <w:rPr>
+          <w:rStyle w:val="NormalTok"/>
+        </w:rPr>
+        <w:t xml:space="preserve"> </w:t>
+      </w:r>
+      <w:r>
+        <w:rPr>
+          <w:rStyle w:val="DataTypeTok"/>
+        </w:rPr>
+        <w:t xml:space="preserve">"basis"</w:t>
+      </w:r>
+      <w:r>
+        <w:rPr>
+          <w:rStyle w:val="FunctionTok"/>
+        </w:rPr>
+        <w:t xml:space="preserve">:</w:t>
+      </w:r>
+      <w:r>
+        <w:rPr>
+          <w:rStyle w:val="NormalTok"/>
+        </w:rPr>
+        <w:t xml:space="preserve"> </w:t>
+      </w:r>
+      <w:r>
+        <w:rPr>
+          <w:rStyle w:val="StringTok"/>
+        </w:rPr>
+        <w:t xml:space="preserve">"International Baccalaureate Diploma Programme 26"</w:t>
+      </w:r>
+      <w:r>
+        <w:rPr>
+          <w:rStyle w:val="FunctionTok"/>
+        </w:rPr>
+        <w:t xml:space="preserve">,</w:t>
+      </w:r>
+      <w:r>
+        <w:rPr>
+          <w:rStyle w:val="NormalTok"/>
+        </w:rPr>
+        <w:t xml:space="preserve"> </w:t>
+      </w:r>
+      <w:r>
+        <w:rPr>
+          <w:rStyle w:val="DataTypeTok"/>
+        </w:rPr>
+        <w:t xml:space="preserve">"audience"</w:t>
+      </w:r>
+      <w:r>
+        <w:rPr>
+          <w:rStyle w:val="FunctionTok"/>
+        </w:rPr>
+        <w:t xml:space="preserve">:</w:t>
+      </w:r>
+      <w:r>
+        <w:rPr>
+          <w:rStyle w:val="NormalTok"/>
+        </w:rPr>
+        <w:t xml:space="preserve"> </w:t>
+      </w:r>
+      <w:r>
+        <w:rPr>
+          <w:rStyle w:val="StringTok"/>
+        </w:rPr>
+        <w:t xml:space="preserve">"international"</w:t>
+      </w:r>
+      <w:r>
+        <w:rPr>
+          <w:rStyle w:val="FunctionTok"/>
+        </w:rPr>
+        <w:t xml:space="preserve">,</w:t>
+      </w:r>
+      <w:r>
+        <w:rPr>
+          <w:rStyle w:val="NormalTok"/>
+        </w:rPr>
+        <w:t xml:space="preserve"> </w:t>
+      </w:r>
+      <w:r>
+        <w:rPr>
+          <w:rStyle w:val="DataTypeTok"/>
+        </w:rPr>
+        <w:t xml:space="preserve">"scale"</w:t>
+      </w:r>
+      <w:r>
+        <w:rPr>
+          <w:rStyle w:val="FunctionTok"/>
+        </w:rPr>
+        <w:t xml:space="preserve">:</w:t>
+      </w:r>
+      <w:r>
+        <w:rPr>
+          <w:rStyle w:val="NormalTok"/>
+        </w:rPr>
+        <w:t xml:space="preserve"> </w:t>
+      </w:r>
+      <w:r>
+        <w:rPr>
+          <w:rStyle w:val="KeywordTok"/>
+        </w:rPr>
+        <w:t xml:space="preserve">null</w:t>
+      </w:r>
+      <w:r>
+        <w:rPr>
+          <w:rStyle w:val="FunctionTok"/>
+        </w:rPr>
+        <w:t xml:space="preserve">,</w:t>
+      </w:r>
+      <w:r>
+        <w:br/>
+      </w:r>
+      <w:r>
+        <w:rPr>
+          <w:rStyle w:val="NormalTok"/>
+        </w:rPr>
+        <w:t xml:space="preserve">    </w:t>
+      </w:r>
+      <w:r>
+        <w:rPr>
+          <w:rStyle w:val="DataTypeTok"/>
+        </w:rPr>
+        <w:t xml:space="preserve">"quote"</w:t>
+      </w:r>
+      <w:r>
+        <w:rPr>
+          <w:rStyle w:val="FunctionTok"/>
+        </w:rPr>
+        <w:t xml:space="preserve">:</w:t>
+      </w:r>
+      <w:r>
+        <w:rPr>
+          <w:rStyle w:val="NormalTok"/>
+        </w:rPr>
+        <w:t xml:space="preserve"> </w:t>
+      </w:r>
+      <w:r>
+        <w:rPr>
+          <w:rStyle w:val="StringTok"/>
+        </w:rPr>
+        <w:t xml:space="preserve">"International Baccalaureate Diploma Programme 26"</w:t>
+      </w:r>
+      <w:r>
+        <w:rPr>
+          <w:rStyle w:val="FunctionTok"/>
+        </w:rPr>
+        <w:t xml:space="preserve">,</w:t>
+      </w:r>
+      <w:r>
+        <w:rPr>
+          <w:rStyle w:val="NormalTok"/>
+        </w:rPr>
+        <w:t xml:space="preserve"> </w:t>
+      </w:r>
+      <w:r>
+        <w:rPr>
+          <w:rStyle w:val="DataTypeTok"/>
+        </w:rPr>
+        <w:t xml:space="preserve">"source_url"</w:t>
+      </w:r>
+      <w:r>
+        <w:rPr>
+          <w:rStyle w:val="FunctionTok"/>
+        </w:rPr>
+        <w:t xml:space="preserve">:</w:t>
+      </w:r>
+      <w:r>
+        <w:rPr>
+          <w:rStyle w:val="NormalTok"/>
+        </w:rPr>
+        <w:t xml:space="preserve"> </w:t>
+      </w:r>
+      <w:r>
+        <w:rPr>
+          <w:rStyle w:val="StringTok"/>
+        </w:rPr>
+        <w:t xml:space="preserve">"https://www.monash.edu/study/course/A2012?international=true"</w:t>
+      </w:r>
+      <w:r>
+        <w:rPr>
+          <w:rStyle w:val="FunctionTok"/>
+        </w:rPr>
+        <w:t xml:space="preserve">,</w:t>
+      </w:r>
+      <w:r>
+        <w:rPr>
+          <w:rStyle w:val="NormalTok"/>
+        </w:rPr>
+        <w:t xml:space="preserve"> </w:t>
+      </w:r>
+      <w:r>
+        <w:rPr>
+          <w:rStyle w:val="DataTypeTok"/>
+        </w:rPr>
+        <w:t xml:space="preserve">"as_at"</w:t>
+      </w:r>
+      <w:r>
+        <w:rPr>
+          <w:rStyle w:val="FunctionTok"/>
+        </w:rPr>
+        <w:t xml:space="preserve">:</w:t>
+      </w:r>
+      <w:r>
+        <w:rPr>
+          <w:rStyle w:val="NormalTok"/>
+        </w:rPr>
+        <w:t xml:space="preserve"> </w:t>
+      </w:r>
+      <w:r>
+        <w:rPr>
+          <w:rStyle w:val="StringTok"/>
+        </w:rPr>
+        <w:t xml:space="preserve">"2026-10-05"</w:t>
+      </w:r>
+      <w:r>
+        <w:rPr>
+          <w:rStyle w:val="NormalTok"/>
+        </w:rPr>
+        <w:t xml:space="preserve"> </w:t>
+      </w:r>
+      <w:r>
+        <w:rPr>
+          <w:rStyle w:val="FunctionTok"/>
+        </w:rPr>
+        <w:t xml:space="preserve">}</w:t>
+      </w:r>
+      <w:r>
+        <w:rPr>
+          <w:rStyle w:val="OtherTok"/>
+        </w:rPr>
+        <w:t xml:space="preserve">,</w:t>
+      </w:r>
+      <w:r>
+        <w:br/>
+      </w:r>
+      <w:r>
+        <w:rPr>
+          <w:rStyle w:val="NormalTok"/>
+        </w:rPr>
+        <w:t xml:space="preserve">  </w:t>
+      </w:r>
+      <w:r>
+        <w:rPr>
+          <w:rStyle w:val="FunctionTok"/>
+        </w:rPr>
+        <w:t xml:space="preserve">{</w:t>
+      </w:r>
+      <w:r>
+        <w:rPr>
+          <w:rStyle w:val="NormalTok"/>
+        </w:rPr>
+        <w:t xml:space="preserve"> </w:t>
+      </w:r>
+      <w:r>
+        <w:rPr>
+          <w:rStyle w:val="DataTypeTok"/>
+        </w:rPr>
+        <w:t xml:space="preserve">"score"</w:t>
+      </w:r>
+      <w:r>
+        <w:rPr>
+          <w:rStyle w:val="FunctionTok"/>
+        </w:rPr>
+        <w:t xml:space="preserve">:</w:t>
+      </w:r>
+      <w:r>
+        <w:rPr>
+          <w:rStyle w:val="NormalTok"/>
+        </w:rPr>
+        <w:t xml:space="preserve"> </w:t>
+      </w:r>
+      <w:r>
+        <w:rPr>
+          <w:rStyle w:val="DecValTok"/>
+        </w:rPr>
+        <w:t xml:space="preserve">8</w:t>
+      </w:r>
+      <w:r>
+        <w:rPr>
+          <w:rStyle w:val="FunctionTok"/>
+        </w:rPr>
+        <w:t xml:space="preserve">,</w:t>
+      </w:r>
+      <w:r>
+        <w:rPr>
+          <w:rStyle w:val="NormalTok"/>
+        </w:rPr>
+        <w:t xml:space="preserve"> </w:t>
+      </w:r>
+      <w:r>
+        <w:rPr>
+          <w:rStyle w:val="DataTypeTok"/>
+        </w:rPr>
+        <w:t xml:space="preserve">"basis"</w:t>
+      </w:r>
+      <w:r>
+        <w:rPr>
+          <w:rStyle w:val="FunctionTok"/>
+        </w:rPr>
+        <w:t xml:space="preserve">:</w:t>
+      </w:r>
+      <w:r>
+        <w:rPr>
+          <w:rStyle w:val="NormalTok"/>
+        </w:rPr>
+        <w:t xml:space="preserve"> </w:t>
+      </w:r>
+      <w:r>
+        <w:rPr>
+          <w:rStyle w:val="StringTok"/>
+        </w:rPr>
+        <w:t xml:space="preserve">"GCE A Level 8"</w:t>
+      </w:r>
+      <w:r>
+        <w:rPr>
+          <w:rStyle w:val="FunctionTok"/>
+        </w:rPr>
+        <w:t xml:space="preserve">,</w:t>
+      </w:r>
+      <w:r>
+        <w:rPr>
+          <w:rStyle w:val="NormalTok"/>
+        </w:rPr>
+        <w:t xml:space="preserve"> </w:t>
+      </w:r>
+      <w:r>
+        <w:rPr>
+          <w:rStyle w:val="DataTypeTok"/>
+        </w:rPr>
+        <w:t xml:space="preserve">"audience"</w:t>
+      </w:r>
+      <w:r>
+        <w:rPr>
+          <w:rStyle w:val="FunctionTok"/>
+        </w:rPr>
+        <w:t xml:space="preserve">:</w:t>
+      </w:r>
+      <w:r>
+        <w:rPr>
+          <w:rStyle w:val="NormalTok"/>
+        </w:rPr>
+        <w:t xml:space="preserve"> </w:t>
+      </w:r>
+      <w:r>
+        <w:rPr>
+          <w:rStyle w:val="StringTok"/>
+        </w:rPr>
+        <w:t xml:space="preserve">"all"</w:t>
+      </w:r>
+      <w:r>
+        <w:rPr>
+          <w:rStyle w:val="FunctionTok"/>
+        </w:rPr>
+        <w:t xml:space="preserve">,</w:t>
+      </w:r>
+      <w:r>
+        <w:rPr>
+          <w:rStyle w:val="NormalTok"/>
+        </w:rPr>
+        <w:t xml:space="preserve"> </w:t>
+      </w:r>
+      <w:r>
+        <w:rPr>
+          <w:rStyle w:val="DataTypeTok"/>
+        </w:rPr>
+        <w:t xml:space="preserve">"scale"</w:t>
+      </w:r>
+      <w:r>
+        <w:rPr>
+          <w:rStyle w:val="FunctionTok"/>
+        </w:rPr>
+        <w:t xml:space="preserve">:</w:t>
+      </w:r>
+      <w:r>
+        <w:rPr>
+          <w:rStyle w:val="NormalTok"/>
+        </w:rPr>
+        <w:t xml:space="preserve"> </w:t>
+      </w:r>
+      <w:r>
+        <w:rPr>
+          <w:rStyle w:val="KeywordTok"/>
+        </w:rPr>
+        <w:t xml:space="preserve">null</w:t>
+      </w:r>
+      <w:r>
+        <w:rPr>
+          <w:rStyle w:val="FunctionTok"/>
+        </w:rPr>
+        <w:t xml:space="preserve">,</w:t>
+      </w:r>
+      <w:r>
+        <w:rPr>
+          <w:rStyle w:val="NormalTok"/>
+        </w:rPr>
+        <w:t xml:space="preserve"> </w:t>
+      </w:r>
+      <w:r>
+        <w:rPr>
+          <w:rStyle w:val="DataTypeTok"/>
+        </w:rPr>
+        <w:t xml:space="preserve">"quote"</w:t>
+      </w:r>
+      <w:r>
+        <w:rPr>
+          <w:rStyle w:val="FunctionTok"/>
+        </w:rPr>
+        <w:t xml:space="preserve">:</w:t>
+      </w:r>
+      <w:r>
+        <w:rPr>
+          <w:rStyle w:val="NormalTok"/>
+        </w:rPr>
+        <w:t xml:space="preserve"> </w:t>
+      </w:r>
+      <w:r>
+        <w:rPr>
+          <w:rStyle w:val="StringTok"/>
+        </w:rPr>
+        <w:t xml:space="preserve">"GCE A Level 8"</w:t>
+      </w:r>
+      <w:r>
+        <w:rPr>
+          <w:rStyle w:val="FunctionTok"/>
+        </w:rPr>
+        <w:t xml:space="preserve">,</w:t>
+      </w:r>
+      <w:r>
+        <w:rPr>
+          <w:rStyle w:val="NormalTok"/>
+        </w:rPr>
+        <w:t xml:space="preserve"> </w:t>
+      </w:r>
+      <w:r>
+        <w:rPr>
+          <w:rStyle w:val="DataTypeTok"/>
+        </w:rPr>
+        <w:t xml:space="preserve">"source_url"</w:t>
+      </w:r>
+      <w:r>
+        <w:rPr>
+          <w:rStyle w:val="FunctionTok"/>
+        </w:rPr>
+        <w:t xml:space="preserve">:</w:t>
+      </w:r>
+      <w:r>
+        <w:rPr>
+          <w:rStyle w:val="NormalTok"/>
+        </w:rPr>
+        <w:t xml:space="preserve"> </w:t>
+      </w:r>
+      <w:r>
+        <w:rPr>
+          <w:rStyle w:val="StringTok"/>
+        </w:rPr>
+        <w:t xml:space="preserve">"https://www.monash.edu/study/course/A2012?international=true"</w:t>
+      </w:r>
+      <w:r>
+        <w:rPr>
+          <w:rStyle w:val="FunctionTok"/>
+        </w:rPr>
+        <w:t xml:space="preserve">,</w:t>
+      </w:r>
+      <w:r>
+        <w:rPr>
+          <w:rStyle w:val="NormalTok"/>
+        </w:rPr>
+        <w:t xml:space="preserve"> </w:t>
+      </w:r>
+      <w:r>
+        <w:rPr>
+          <w:rStyle w:val="DataTypeTok"/>
+        </w:rPr>
+        <w:t xml:space="preserve">"as_at"</w:t>
+      </w:r>
+      <w:r>
+        <w:rPr>
+          <w:rStyle w:val="FunctionTok"/>
+        </w:rPr>
+        <w:t xml:space="preserve">:</w:t>
+      </w:r>
+      <w:r>
+        <w:rPr>
+          <w:rStyle w:val="NormalTok"/>
+        </w:rPr>
+        <w:t xml:space="preserve"> </w:t>
+      </w:r>
+      <w:r>
+        <w:rPr>
+          <w:rStyle w:val="StringTok"/>
+        </w:rPr>
+        <w:t xml:space="preserve">"2026-10-05"</w:t>
+      </w:r>
+      <w:r>
+        <w:rPr>
+          <w:rStyle w:val="NormalTok"/>
+        </w:rPr>
+        <w:t xml:space="preserve"> </w:t>
+      </w:r>
+      <w:r>
+        <w:rPr>
+          <w:rStyle w:val="FunctionTok"/>
+        </w:rPr>
+        <w:t xml:space="preserve">}</w:t>
+      </w:r>
+      <w:r>
+        <w:rPr>
+          <w:rStyle w:val="OtherTok"/>
+        </w:rPr>
+        <w:t xml:space="preserve">,</w:t>
+      </w:r>
+      <w:r>
+        <w:br/>
+      </w:r>
+      <w:r>
+        <w:rPr>
+          <w:rStyle w:val="NormalTok"/>
+        </w:rPr>
+        <w:t xml:space="preserve">  </w:t>
+      </w:r>
+      <w:r>
+        <w:rPr>
+          <w:rStyle w:val="FunctionTok"/>
+        </w:rPr>
+        <w:t xml:space="preserve">{</w:t>
+      </w:r>
+      <w:r>
+        <w:rPr>
+          <w:rStyle w:val="NormalTok"/>
+        </w:rPr>
+        <w:t xml:space="preserve"> </w:t>
+      </w:r>
+      <w:r>
+        <w:rPr>
+          <w:rStyle w:val="DataTypeTok"/>
+        </w:rPr>
+        <w:t xml:space="preserve">"score"</w:t>
+      </w:r>
+      <w:r>
+        <w:rPr>
+          <w:rStyle w:val="FunctionTok"/>
+        </w:rPr>
+        <w:t xml:space="preserve">:</w:t>
+      </w:r>
+      <w:r>
+        <w:rPr>
+          <w:rStyle w:val="NormalTok"/>
+        </w:rPr>
+        <w:t xml:space="preserve"> </w:t>
+      </w:r>
+      <w:r>
+        <w:rPr>
+          <w:rStyle w:val="DecValTok"/>
+        </w:rPr>
+        <w:t xml:space="preserve">75</w:t>
+      </w:r>
+      <w:r>
+        <w:rPr>
+          <w:rStyle w:val="FunctionTok"/>
+        </w:rPr>
+        <w:t xml:space="preserve">,</w:t>
+      </w:r>
+      <w:r>
+        <w:rPr>
+          <w:rStyle w:val="NormalTok"/>
+        </w:rPr>
+        <w:t xml:space="preserve"> </w:t>
+      </w:r>
+      <w:r>
+        <w:rPr>
+          <w:rStyle w:val="DataTypeTok"/>
+        </w:rPr>
+        <w:t xml:space="preserve">"basis"</w:t>
+      </w:r>
+      <w:r>
+        <w:rPr>
+          <w:rStyle w:val="FunctionTok"/>
+        </w:rPr>
+        <w:t xml:space="preserve">:</w:t>
+      </w:r>
+      <w:r>
+        <w:rPr>
+          <w:rStyle w:val="NormalTok"/>
+        </w:rPr>
+        <w:t xml:space="preserve"> </w:t>
+      </w:r>
+      <w:r>
+        <w:rPr>
+          <w:rStyle w:val="StringTok"/>
+        </w:rPr>
+        <w:t xml:space="preserve">"ATAR 75"</w:t>
+      </w:r>
+      <w:r>
+        <w:rPr>
+          <w:rStyle w:val="FunctionTok"/>
+        </w:rPr>
+        <w:t xml:space="preserve">,</w:t>
+      </w:r>
+      <w:r>
+        <w:rPr>
+          <w:rStyle w:val="NormalTok"/>
+        </w:rPr>
+        <w:t xml:space="preserve"> </w:t>
+      </w:r>
+      <w:r>
+        <w:rPr>
+          <w:rStyle w:val="DataTypeTok"/>
+        </w:rPr>
+        <w:t xml:space="preserve">"audience"</w:t>
+      </w:r>
+      <w:r>
+        <w:rPr>
+          <w:rStyle w:val="FunctionTok"/>
+        </w:rPr>
+        <w:t xml:space="preserve">:</w:t>
+      </w:r>
+      <w:r>
+        <w:rPr>
+          <w:rStyle w:val="NormalTok"/>
+        </w:rPr>
+        <w:t xml:space="preserve"> </w:t>
+      </w:r>
+      <w:r>
+        <w:rPr>
+          <w:rStyle w:val="StringTok"/>
+        </w:rPr>
+        <w:t xml:space="preserve">"domestic"</w:t>
+      </w:r>
+      <w:r>
+        <w:rPr>
+          <w:rStyle w:val="FunctionTok"/>
+        </w:rPr>
+        <w:t xml:space="preserve">,</w:t>
+      </w:r>
+      <w:r>
+        <w:rPr>
+          <w:rStyle w:val="NormalTok"/>
+        </w:rPr>
+        <w:t xml:space="preserve"> </w:t>
+      </w:r>
+      <w:r>
+        <w:rPr>
+          <w:rStyle w:val="DataTypeTok"/>
+        </w:rPr>
+        <w:t xml:space="preserve">"scale"</w:t>
+      </w:r>
+      <w:r>
+        <w:rPr>
+          <w:rStyle w:val="FunctionTok"/>
+        </w:rPr>
+        <w:t xml:space="preserve">:</w:t>
+      </w:r>
+      <w:r>
+        <w:rPr>
+          <w:rStyle w:val="NormalTok"/>
+        </w:rPr>
+        <w:t xml:space="preserve"> </w:t>
+      </w:r>
+      <w:r>
+        <w:rPr>
+          <w:rStyle w:val="KeywordTok"/>
+        </w:rPr>
+        <w:t xml:space="preserve">null</w:t>
+      </w:r>
+      <w:r>
+        <w:rPr>
+          <w:rStyle w:val="FunctionTok"/>
+        </w:rPr>
+        <w:t xml:space="preserve">,</w:t>
+      </w:r>
+      <w:r>
+        <w:rPr>
+          <w:rStyle w:val="NormalTok"/>
+        </w:rPr>
+        <w:t xml:space="preserve"> </w:t>
+      </w:r>
+      <w:r>
+        <w:rPr>
+          <w:rStyle w:val="DataTypeTok"/>
+        </w:rPr>
+        <w:t xml:space="preserve">"quote"</w:t>
+      </w:r>
+      <w:r>
+        <w:rPr>
+          <w:rStyle w:val="FunctionTok"/>
+        </w:rPr>
+        <w:t xml:space="preserve">:</w:t>
+      </w:r>
+      <w:r>
+        <w:rPr>
+          <w:rStyle w:val="NormalTok"/>
+        </w:rPr>
+        <w:t xml:space="preserve"> </w:t>
+      </w:r>
+      <w:r>
+        <w:rPr>
+          <w:rStyle w:val="StringTok"/>
+        </w:rPr>
+        <w:t xml:space="preserve">"ATAR 75"</w:t>
+      </w:r>
+      <w:r>
+        <w:rPr>
+          <w:rStyle w:val="FunctionTok"/>
+        </w:rPr>
+        <w:t xml:space="preserve">,</w:t>
+      </w:r>
+      <w:r>
+        <w:rPr>
+          <w:rStyle w:val="NormalTok"/>
+        </w:rPr>
+        <w:t xml:space="preserve"> </w:t>
+      </w:r>
+      <w:r>
+        <w:rPr>
+          <w:rStyle w:val="DataTypeTok"/>
+        </w:rPr>
+        <w:t xml:space="preserve">"source_url"</w:t>
+      </w:r>
+      <w:r>
+        <w:rPr>
+          <w:rStyle w:val="FunctionTok"/>
+        </w:rPr>
+        <w:t xml:space="preserve">:</w:t>
+      </w:r>
+      <w:r>
+        <w:rPr>
+          <w:rStyle w:val="NormalTok"/>
+        </w:rPr>
+        <w:t xml:space="preserve"> </w:t>
+      </w:r>
+      <w:r>
+        <w:rPr>
+          <w:rStyle w:val="StringTok"/>
+        </w:rPr>
+        <w:t xml:space="preserve">"https://www.monash.edu/study/course/A2012?international=true"</w:t>
+      </w:r>
+      <w:r>
+        <w:rPr>
+          <w:rStyle w:val="FunctionTok"/>
+        </w:rPr>
+        <w:t xml:space="preserve">,</w:t>
+      </w:r>
+      <w:r>
+        <w:rPr>
+          <w:rStyle w:val="NormalTok"/>
+        </w:rPr>
+        <w:t xml:space="preserve"> </w:t>
+      </w:r>
+      <w:r>
+        <w:rPr>
+          <w:rStyle w:val="DataTypeTok"/>
+        </w:rPr>
+        <w:t xml:space="preserve">"as_at"</w:t>
+      </w:r>
+      <w:r>
+        <w:rPr>
+          <w:rStyle w:val="FunctionTok"/>
+        </w:rPr>
+        <w:t xml:space="preserve">:</w:t>
+      </w:r>
+      <w:r>
+        <w:rPr>
+          <w:rStyle w:val="NormalTok"/>
+        </w:rPr>
+        <w:t xml:space="preserve"> </w:t>
+      </w:r>
+      <w:r>
+        <w:rPr>
+          <w:rStyle w:val="StringTok"/>
+        </w:rPr>
+        <w:t xml:space="preserve">"2026-10-05"</w:t>
+      </w:r>
+      <w:r>
+        <w:rPr>
+          <w:rStyle w:val="NormalTok"/>
+        </w:rPr>
+        <w:t xml:space="preserve"> </w:t>
+      </w:r>
+      <w:r>
+        <w:rPr>
+          <w:rStyle w:val="FunctionTok"/>
+        </w:rPr>
+        <w:t xml:space="preserve">}</w:t>
+      </w:r>
+      <w:r>
+        <w:br/>
+      </w:r>
+      <w:r>
+        <w:rPr>
+          <w:rStyle w:val="OtherTok"/>
+        </w:rPr>
+        <w:t xml:space="preserve">]</w:t>
+      </w:r>
+    </w:p>
+    <w:p>
+      <w:pPr>
+        <w:pStyle w:val="FirstParagraph"/>
+      </w:pPr>
+      <w:r>
+        <w:t xml:space="preserve">(Course</w:t>
+      </w:r>
+      <w:r>
+        <w:t xml:space="preserve"> </w:t>
+      </w:r>
+      <w:r>
+        <w:rPr>
+          <w:rStyle w:val="VerbatimChar"/>
+        </w:rPr>
+        <w:t xml:space="preserve">0101331</w:t>
+      </w:r>
+      <w:r>
+        <w:t xml:space="preserve">, shortened to three of its six items.)</w:t>
+      </w:r>
+    </w:p>
+    <w:p>
+      <w:pPr>
+        <w:pStyle w:val="BodyText"/>
+      </w:pPr>
+      <w:r>
+        <w:rPr>
+          <w:rStyle w:val="VerbatimChar"/>
+          <w:bCs/>
+          <w:b/>
+        </w:rPr>
+        <w:t xml:space="preserve">resolution</w:t>
+      </w:r>
+      <w:r>
+        <w:t xml:space="preserve">: the requirement that applies to a student from that country. It is worked out in a fixed order, and the first rule that applies is used:</w:t>
       </w:r>
     </w:p>
     <w:p>
       <w:pPr>
         <w:numPr>
           <w:ilvl w:val="0"/>
-          <w:numId w:val="1011"/>
+          <w:numId w:val="1012"/>
         </w:numPr>
         <w:pStyle w:val="Compact"/>
       </w:pPr>
       <w:r>
-        <w:t xml:space="preserve">the provider’s minimum for the country and the course level;</w:t>
+        <w:t xml:space="preserve">a rule the course page states for itself;</w:t>
       </w:r>
     </w:p>
     <w:p>
       <w:pPr>
         <w:numPr>
           <w:ilvl w:val="0"/>
-          <w:numId w:val="1011"/>
+          <w:numId w:val="1012"/>
+        </w:numPr>
+        <w:pStyle w:val="Compact"/>
+      </w:pPr>
+      <w:r>
+        <w:t xml:space="preserve">the provider’s row for this course and country;</w:t>
+      </w:r>
+    </w:p>
+    <w:p>
+      <w:pPr>
+        <w:numPr>
+          <w:ilvl w:val="0"/>
+          <w:numId w:val="1012"/>
+        </w:numPr>
+        <w:pStyle w:val="Compact"/>
+      </w:pPr>
+      <w:r>
+        <w:t xml:space="preserve">the course’s band, looked up in the provider’s table for the country;</w:t>
+      </w:r>
+    </w:p>
+    <w:p>
+      <w:pPr>
+        <w:numPr>
+          <w:ilvl w:val="0"/>
+          <w:numId w:val="1012"/>
+        </w:numPr>
+        <w:pStyle w:val="Compact"/>
+      </w:pPr>
+      <w:r>
+        <w:t xml:space="preserve">the provider’s minimum for the country and the course level;</w:t>
+      </w:r>
+    </w:p>
+    <w:p>
+      <w:pPr>
+        <w:numPr>
+          <w:ilvl w:val="0"/>
+          <w:numId w:val="1012"/>
         </w:numPr>
         <w:pStyle w:val="Compact"/>
       </w:pPr>
@@ -13323,7 +14529,7 @@
       <w:pPr>
         <w:numPr>
           <w:ilvl w:val="0"/>
-          <w:numId w:val="1012"/>
+          <w:numId w:val="1013"/>
         </w:numPr>
         <w:pStyle w:val="Compact"/>
       </w:pPr>
@@ -13368,7 +14574,7 @@
       <w:pPr>
         <w:numPr>
           <w:ilvl w:val="0"/>
-          <w:numId w:val="1012"/>
+          <w:numId w:val="1013"/>
         </w:numPr>
         <w:pStyle w:val="Compact"/>
       </w:pPr>
@@ -13532,7 +14738,7 @@
       <w:pPr>
         <w:numPr>
           <w:ilvl w:val="0"/>
-          <w:numId w:val="1012"/>
+          <w:numId w:val="1013"/>
         </w:numPr>
         <w:pStyle w:val="Compact"/>
       </w:pPr>
@@ -13693,7 +14899,7 @@
       <w:pPr>
         <w:numPr>
           <w:ilvl w:val="0"/>
-          <w:numId w:val="1012"/>
+          <w:numId w:val="1013"/>
         </w:numPr>
         <w:pStyle w:val="Compact"/>
       </w:pPr>
@@ -14761,6 +15967,330 @@
         <w:rPr>
           <w:rStyle w:val="DataTypeTok"/>
         </w:rPr>
+        <w:t xml:space="preserve">"min_scores"</w:t>
+      </w:r>
+      <w:r>
+        <w:rPr>
+          <w:rStyle w:val="FunctionTok"/>
+        </w:rPr>
+        <w:t xml:space="preserve">:</w:t>
+      </w:r>
+      <w:r>
+        <w:rPr>
+          <w:rStyle w:val="NormalTok"/>
+        </w:rPr>
+        <w:t xml:space="preserve"> </w:t>
+      </w:r>
+      <w:r>
+        <w:rPr>
+          <w:rStyle w:val="OtherTok"/>
+        </w:rPr>
+        <w:t xml:space="preserve">[</w:t>
+      </w:r>
+      <w:r>
+        <w:rPr>
+          <w:rStyle w:val="NormalTok"/>
+        </w:rPr>
+        <w:t xml:space="preserve"> </w:t>
+      </w:r>
+      <w:r>
+        <w:rPr>
+          <w:rStyle w:val="FunctionTok"/>
+        </w:rPr>
+        <w:t xml:space="preserve">{</w:t>
+      </w:r>
+      <w:r>
+        <w:rPr>
+          <w:rStyle w:val="NormalTok"/>
+        </w:rPr>
+        <w:t xml:space="preserve"> </w:t>
+      </w:r>
+      <w:r>
+        <w:rPr>
+          <w:rStyle w:val="DataTypeTok"/>
+        </w:rPr>
+        <w:t xml:space="preserve">"score"</w:t>
+      </w:r>
+      <w:r>
+        <w:rPr>
+          <w:rStyle w:val="FunctionTok"/>
+        </w:rPr>
+        <w:t xml:space="preserve">:</w:t>
+      </w:r>
+      <w:r>
+        <w:rPr>
+          <w:rStyle w:val="NormalTok"/>
+        </w:rPr>
+        <w:t xml:space="preserve"> </w:t>
+      </w:r>
+      <w:r>
+        <w:rPr>
+          <w:rStyle w:val="DecValTok"/>
+        </w:rPr>
+        <w:t xml:space="preserve">73</w:t>
+      </w:r>
+      <w:r>
+        <w:rPr>
+          <w:rStyle w:val="FunctionTok"/>
+        </w:rPr>
+        <w:t xml:space="preserve">,</w:t>
+      </w:r>
+      <w:r>
+        <w:rPr>
+          <w:rStyle w:val="NormalTok"/>
+        </w:rPr>
+        <w:t xml:space="preserve"> </w:t>
+      </w:r>
+      <w:r>
+        <w:rPr>
+          <w:rStyle w:val="DataTypeTok"/>
+        </w:rPr>
+        <w:t xml:space="preserve">"basis"</w:t>
+      </w:r>
+      <w:r>
+        <w:rPr>
+          <w:rStyle w:val="FunctionTok"/>
+        </w:rPr>
+        <w:t xml:space="preserve">:</w:t>
+      </w:r>
+      <w:r>
+        <w:rPr>
+          <w:rStyle w:val="NormalTok"/>
+        </w:rPr>
+        <w:t xml:space="preserve"> </w:t>
+      </w:r>
+      <w:r>
+        <w:rPr>
+          <w:rStyle w:val="StringTok"/>
+        </w:rPr>
+        <w:t xml:space="preserve">"2026 ATAR"</w:t>
+      </w:r>
+      <w:r>
+        <w:rPr>
+          <w:rStyle w:val="FunctionTok"/>
+        </w:rPr>
+        <w:t xml:space="preserve">,</w:t>
+      </w:r>
+      <w:r>
+        <w:rPr>
+          <w:rStyle w:val="NormalTok"/>
+        </w:rPr>
+        <w:t xml:space="preserve"> </w:t>
+      </w:r>
+      <w:r>
+        <w:rPr>
+          <w:rStyle w:val="DataTypeTok"/>
+        </w:rPr>
+        <w:t xml:space="preserve">"audience"</w:t>
+      </w:r>
+      <w:r>
+        <w:rPr>
+          <w:rStyle w:val="FunctionTok"/>
+        </w:rPr>
+        <w:t xml:space="preserve">:</w:t>
+      </w:r>
+      <w:r>
+        <w:rPr>
+          <w:rStyle w:val="NormalTok"/>
+        </w:rPr>
+        <w:t xml:space="preserve"> </w:t>
+      </w:r>
+      <w:r>
+        <w:rPr>
+          <w:rStyle w:val="StringTok"/>
+        </w:rPr>
+        <w:t xml:space="preserve">"domestic"</w:t>
+      </w:r>
+      <w:r>
+        <w:rPr>
+          <w:rStyle w:val="FunctionTok"/>
+        </w:rPr>
+        <w:t xml:space="preserve">,</w:t>
+      </w:r>
+      <w:r>
+        <w:rPr>
+          <w:rStyle w:val="NormalTok"/>
+        </w:rPr>
+        <w:t xml:space="preserve"> </w:t>
+      </w:r>
+      <w:r>
+        <w:rPr>
+          <w:rStyle w:val="DataTypeTok"/>
+        </w:rPr>
+        <w:t xml:space="preserve">"scale"</w:t>
+      </w:r>
+      <w:r>
+        <w:rPr>
+          <w:rStyle w:val="FunctionTok"/>
+        </w:rPr>
+        <w:t xml:space="preserve">:</w:t>
+      </w:r>
+      <w:r>
+        <w:rPr>
+          <w:rStyle w:val="NormalTok"/>
+        </w:rPr>
+        <w:t xml:space="preserve"> </w:t>
+      </w:r>
+      <w:r>
+        <w:rPr>
+          <w:rStyle w:val="KeywordTok"/>
+        </w:rPr>
+        <w:t xml:space="preserve">null</w:t>
+      </w:r>
+      <w:r>
+        <w:rPr>
+          <w:rStyle w:val="FunctionTok"/>
+        </w:rPr>
+        <w:t xml:space="preserve">,</w:t>
+      </w:r>
+      <w:r>
+        <w:rPr>
+          <w:rStyle w:val="NormalTok"/>
+        </w:rPr>
+        <w:t xml:space="preserve"> </w:t>
+      </w:r>
+      <w:r>
+        <w:rPr>
+          <w:rStyle w:val="DataTypeTok"/>
+        </w:rPr>
+        <w:t xml:space="preserve">"quote"</w:t>
+      </w:r>
+      <w:r>
+        <w:rPr>
+          <w:rStyle w:val="FunctionTok"/>
+        </w:rPr>
+        <w:t xml:space="preserve">:</w:t>
+      </w:r>
+      <w:r>
+        <w:rPr>
+          <w:rStyle w:val="NormalTok"/>
+        </w:rPr>
+        <w:t xml:space="preserve"> </w:t>
+      </w:r>
+      <w:r>
+        <w:rPr>
+          <w:rStyle w:val="StringTok"/>
+        </w:rPr>
+        <w:t xml:space="preserve">"2026 ATAR 73.00"</w:t>
+      </w:r>
+      <w:r>
+        <w:rPr>
+          <w:rStyle w:val="FunctionTok"/>
+        </w:rPr>
+        <w:t xml:space="preserve">,</w:t>
+      </w:r>
+      <w:r>
+        <w:br/>
+      </w:r>
+      <w:r>
+        <w:rPr>
+          <w:rStyle w:val="NormalTok"/>
+        </w:rPr>
+        <w:t xml:space="preserve">    </w:t>
+      </w:r>
+      <w:r>
+        <w:rPr>
+          <w:rStyle w:val="DataTypeTok"/>
+        </w:rPr>
+        <w:t xml:space="preserve">"source_url"</w:t>
+      </w:r>
+      <w:r>
+        <w:rPr>
+          <w:rStyle w:val="FunctionTok"/>
+        </w:rPr>
+        <w:t xml:space="preserve">:</w:t>
+      </w:r>
+      <w:r>
+        <w:rPr>
+          <w:rStyle w:val="NormalTok"/>
+        </w:rPr>
+        <w:t xml:space="preserve"> </w:t>
+      </w:r>
+      <w:r>
+        <w:rPr>
+          <w:rStyle w:val="StringTok"/>
+        </w:rPr>
+        <w:t xml:space="preserve">"https://www.rmit.edu.au/study-with-us/levels-of-study/undergraduate-study/honours-degrees/bachelor-of-engineering-honours-bh126"</w:t>
+      </w:r>
+      <w:r>
+        <w:rPr>
+          <w:rStyle w:val="FunctionTok"/>
+        </w:rPr>
+        <w:t xml:space="preserve">,</w:t>
+      </w:r>
+      <w:r>
+        <w:rPr>
+          <w:rStyle w:val="NormalTok"/>
+        </w:rPr>
+        <w:t xml:space="preserve"> </w:t>
+      </w:r>
+      <w:r>
+        <w:rPr>
+          <w:rStyle w:val="DataTypeTok"/>
+        </w:rPr>
+        <w:t xml:space="preserve">"as_at"</w:t>
+      </w:r>
+      <w:r>
+        <w:rPr>
+          <w:rStyle w:val="FunctionTok"/>
+        </w:rPr>
+        <w:t xml:space="preserve">:</w:t>
+      </w:r>
+      <w:r>
+        <w:rPr>
+          <w:rStyle w:val="NormalTok"/>
+        </w:rPr>
+        <w:t xml:space="preserve"> </w:t>
+      </w:r>
+      <w:r>
+        <w:rPr>
+          <w:rStyle w:val="StringTok"/>
+        </w:rPr>
+        <w:t xml:space="preserve">"2026-10-05"</w:t>
+      </w:r>
+      <w:r>
+        <w:rPr>
+          <w:rStyle w:val="NormalTok"/>
+        </w:rPr>
+        <w:t xml:space="preserve"> </w:t>
+      </w:r>
+      <w:r>
+        <w:rPr>
+          <w:rStyle w:val="FunctionTok"/>
+        </w:rPr>
+        <w:t xml:space="preserve">}</w:t>
+      </w:r>
+      <w:r>
+        <w:rPr>
+          <w:rStyle w:val="NormalTok"/>
+        </w:rPr>
+        <w:t xml:space="preserve"> </w:t>
+      </w:r>
+      <w:r>
+        <w:rPr>
+          <w:rStyle w:val="OtherTok"/>
+        </w:rPr>
+        <w:t xml:space="preserve">]</w:t>
+      </w:r>
+      <w:r>
+        <w:rPr>
+          <w:rStyle w:val="FunctionTok"/>
+        </w:rPr>
+        <w:t xml:space="preserve">,</w:t>
+      </w:r>
+      <w:r>
+        <w:br/>
+      </w:r>
+      <w:r>
+        <w:rPr>
+          <w:rStyle w:val="NormalTok"/>
+        </w:rPr>
+        <w:t xml:space="preserve">  </w:t>
+      </w:r>
+      <w:r>
+        <w:rPr>
+          <w:rStyle w:val="DataTypeTok"/>
+        </w:rPr>
         <w:t xml:space="preserve">"benchmark_band"</w:t>
       </w:r>
       <w:r>
@@ -14788,13 +16318,10 @@
         <w:t xml:space="preserve">,</w:t>
       </w:r>
       <w:r>
-        <w:br/>
-      </w:r>
-      <w:r>
-        <w:rPr>
-          <w:rStyle w:val="NormalTok"/>
-        </w:rPr>
-        <w:t xml:space="preserve">  </w:t>
+        <w:rPr>
+          <w:rStyle w:val="NormalTok"/>
+        </w:rPr>
+        <w:t xml:space="preserve"> </w:t>
       </w:r>
       <w:r>
         <w:rPr>
@@ -17443,6 +18970,66 @@
         <w:rPr>
           <w:rStyle w:val="DataTypeTok"/>
         </w:rPr>
+        <w:t xml:space="preserve">"min_scores"</w:t>
+      </w:r>
+      <w:r>
+        <w:rPr>
+          <w:rStyle w:val="FunctionTok"/>
+        </w:rPr>
+        <w:t xml:space="preserve">:</w:t>
+      </w:r>
+      <w:r>
+        <w:rPr>
+          <w:rStyle w:val="NormalTok"/>
+        </w:rPr>
+        <w:t xml:space="preserve"> </w:t>
+      </w:r>
+      <w:r>
+        <w:rPr>
+          <w:rStyle w:val="OtherTok"/>
+        </w:rPr>
+        <w:t xml:space="preserve">[</w:t>
+      </w:r>
+      <w:r>
+        <w:rPr>
+          <w:rStyle w:val="NormalTok"/>
+        </w:rPr>
+        <w:t xml:space="preserve"> </w:t>
+      </w:r>
+      <w:r>
+        <w:rPr>
+          <w:rStyle w:val="ErrorTok"/>
+        </w:rPr>
+        <w:t xml:space="preserve">…</w:t>
+      </w:r>
+      <w:r>
+        <w:rPr>
+          <w:rStyle w:val="NormalTok"/>
+        </w:rPr>
+        <w:t xml:space="preserve"> </w:t>
+      </w:r>
+      <w:r>
+        <w:rPr>
+          <w:rStyle w:val="OtherTok"/>
+        </w:rPr>
+        <w:t xml:space="preserve">]</w:t>
+      </w:r>
+      <w:r>
+        <w:rPr>
+          <w:rStyle w:val="FunctionTok"/>
+        </w:rPr>
+        <w:t xml:space="preserve">,</w:t>
+      </w:r>
+      <w:r>
+        <w:rPr>
+          <w:rStyle w:val="NormalTok"/>
+        </w:rPr>
+        <w:t xml:space="preserve"> </w:t>
+      </w:r>
+      <w:r>
+        <w:rPr>
+          <w:rStyle w:val="DataTypeTok"/>
+        </w:rPr>
         <w:t xml:space="preserve">"benchmark_band"</w:t>
       </w:r>
       <w:r>
@@ -17737,7 +19324,7 @@
       <w:pPr>
         <w:numPr>
           <w:ilvl w:val="0"/>
-          <w:numId w:val="1013"/>
+          <w:numId w:val="1014"/>
         </w:numPr>
         <w:pStyle w:val="Compact"/>
       </w:pPr>
@@ -17759,7 +19346,7 @@
       <w:pPr>
         <w:numPr>
           <w:ilvl w:val="0"/>
-          <w:numId w:val="1013"/>
+          <w:numId w:val="1014"/>
         </w:numPr>
         <w:pStyle w:val="Compact"/>
       </w:pPr>
@@ -17901,7 +19488,7 @@
       <w:pPr>
         <w:numPr>
           <w:ilvl w:val="0"/>
-          <w:numId w:val="1013"/>
+          <w:numId w:val="1014"/>
         </w:numPr>
         <w:pStyle w:val="Compact"/>
       </w:pPr>
@@ -17947,7 +19534,7 @@
       <w:pPr>
         <w:numPr>
           <w:ilvl w:val="0"/>
-          <w:numId w:val="1013"/>
+          <w:numId w:val="1014"/>
         </w:numPr>
         <w:pStyle w:val="Compact"/>
       </w:pPr>
@@ -19263,7 +20850,7 @@
       <w:pPr>
         <w:numPr>
           <w:ilvl w:val="0"/>
-          <w:numId w:val="1014"/>
+          <w:numId w:val="1015"/>
         </w:numPr>
         <w:pStyle w:val="Compact"/>
       </w:pPr>
@@ -19275,7 +20862,7 @@
       <w:pPr>
         <w:numPr>
           <w:ilvl w:val="0"/>
-          <w:numId w:val="1014"/>
+          <w:numId w:val="1015"/>
         </w:numPr>
         <w:pStyle w:val="Compact"/>
       </w:pPr>
@@ -19299,7 +20886,7 @@
       <w:pPr>
         <w:numPr>
           <w:ilvl w:val="0"/>
-          <w:numId w:val="1014"/>
+          <w:numId w:val="1015"/>
         </w:numPr>
         <w:pStyle w:val="Compact"/>
       </w:pPr>
@@ -20852,6 +22439,134 @@
               <w:jc w:val="left"/>
             </w:pPr>
             <w:r>
+              <w:t xml:space="preserve">24</w:t>
+            </w:r>
+          </w:p>
+        </w:tc>
+        <w:tc>
+          <w:tcPr/>
+          <w:p>
+            <w:pPr>
+              <w:pStyle w:val="Compact"/>
+              <w:jc w:val="left"/>
+            </w:pPr>
+            <w:r>
+              <w:t xml:space="preserve">Entry, several scores</w:t>
+            </w:r>
+          </w:p>
+        </w:tc>
+        <w:tc>
+          <w:tcPr/>
+          <w:p>
+            <w:pPr>
+              <w:pStyle w:val="Compact"/>
+              <w:jc w:val="left"/>
+            </w:pPr>
+            <w:r>
+              <w:rPr>
+                <w:rStyle w:val="VerbatimChar"/>
+              </w:rPr>
+              <w:t xml:space="preserve">course</w:t>
+            </w:r>
+            <w:r>
+              <w:t xml:space="preserve"> </w:t>
+            </w:r>
+            <w:r>
+              <w:t xml:space="preserve">with</w:t>
+            </w:r>
+            <w:r>
+              <w:t xml:space="preserve"> </w:t>
+            </w:r>
+            <w:r>
+              <w:rPr>
+                <w:rStyle w:val="VerbatimChar"/>
+              </w:rPr>
+              <w:t xml:space="preserve">course_code</w:t>
+            </w:r>
+            <w:r>
+              <w:t xml:space="preserve"> </w:t>
+            </w:r>
+            <w:r>
+              <w:t xml:space="preserve">0101331 returns</w:t>
+            </w:r>
+            <w:r>
+              <w:t xml:space="preserve"> </w:t>
+            </w:r>
+            <w:r>
+              <w:rPr>
+                <w:rStyle w:val="VerbatimChar"/>
+              </w:rPr>
+              <w:t xml:space="preserve">entry.min_scores</w:t>
+            </w:r>
+            <w:r>
+              <w:t xml:space="preserve"> </w:t>
+            </w:r>
+            <w:r>
+              <w:t xml:space="preserve">with 6 items, the first</w:t>
+            </w:r>
+            <w:r>
+              <w:t xml:space="preserve"> </w:t>
+            </w:r>
+            <w:r>
+              <w:rPr>
+                <w:rStyle w:val="VerbatimChar"/>
+              </w:rPr>
+              <w:t xml:space="preserve">audience</w:t>
+            </w:r>
+            <w:r>
+              <w:t xml:space="preserve"> </w:t>
+            </w:r>
+            <w:r>
+              <w:rPr>
+                <w:rStyle w:val="VerbatimChar"/>
+              </w:rPr>
+              <w:t xml:space="preserve">international</w:t>
+            </w:r>
+            <w:r>
+              <w:t xml:space="preserve"> </w:t>
+            </w:r>
+            <w:r>
+              <w:t xml:space="preserve">(IB 26), and</w:t>
+            </w:r>
+            <w:r>
+              <w:t xml:space="preserve"> </w:t>
+            </w:r>
+            <w:r>
+              <w:rPr>
+                <w:rStyle w:val="VerbatimChar"/>
+              </w:rPr>
+              <w:t xml:space="preserve">min_score</w:t>
+            </w:r>
+            <w:r>
+              <w:t xml:space="preserve"> </w:t>
+            </w:r>
+            <w:r>
+              <w:t xml:space="preserve">unchanged; a course without scores returns</w:t>
+            </w:r>
+            <w:r>
+              <w:t xml:space="preserve"> </w:t>
+            </w:r>
+            <w:r>
+              <w:rPr>
+                <w:rStyle w:val="VerbatimChar"/>
+              </w:rPr>
+              <w:t xml:space="preserve">min_scores: []</w:t>
+            </w:r>
+            <w:r>
+              <w:t xml:space="preserve">. On 31 October 2026, 41 courses hold scores (116 items; 24 courses with more than one)</w:t>
+            </w:r>
+          </w:p>
+        </w:tc>
+      </w:tr>
+      <w:tr>
+        <w:tc>
+          <w:tcPr/>
+          <w:p>
+            <w:pPr>
+              <w:pStyle w:val="Compact"/>
+              <w:jc w:val="left"/>
+            </w:pPr>
+            <w:r>
               <w:t xml:space="preserve">23</w:t>
             </w:r>
           </w:p>
@@ -21560,6 +23275,170 @@
             </w:r>
             <w:r>
               <w:t xml:space="preserve">(the provider’s published requirements by country). Section 7.9 added; acceptance tests 20 to 22 added</w:t>
+            </w:r>
+          </w:p>
+        </w:tc>
+      </w:tr>
+      <w:tr>
+        <w:tc>
+          <w:tcPr/>
+          <w:p>
+            <w:pPr>
+              <w:pStyle w:val="Compact"/>
+              <w:jc w:val="left"/>
+            </w:pPr>
+            <w:r>
+              <w:t xml:space="preserve">31 October 2026 (issue 7)</w:t>
+            </w:r>
+          </w:p>
+        </w:tc>
+        <w:tc>
+          <w:tcPr/>
+          <w:p>
+            <w:pPr>
+              <w:pStyle w:val="Compact"/>
+              <w:jc w:val="left"/>
+            </w:pPr>
+            <w:r>
+              <w:t xml:space="preserve">The course detail’s</w:t>
+            </w:r>
+            <w:r>
+              <w:t xml:space="preserve"> </w:t>
+            </w:r>
+            <w:r>
+              <w:rPr>
+                <w:rStyle w:val="VerbatimChar"/>
+              </w:rPr>
+              <w:t xml:space="preserve">entry</w:t>
+            </w:r>
+            <w:r>
+              <w:t xml:space="preserve"> </w:t>
+            </w:r>
+            <w:r>
+              <w:t xml:space="preserve">gains</w:t>
+            </w:r>
+            <w:r>
+              <w:t xml:space="preserve"> </w:t>
+            </w:r>
+            <w:r>
+              <w:rPr>
+                <w:rStyle w:val="VerbatimChar"/>
+              </w:rPr>
+              <w:t xml:space="preserve">min_scores[]</w:t>
+            </w:r>
+            <w:r>
+              <w:t xml:space="preserve">: every entry score the course publishes, as printed (</w:t>
+            </w:r>
+            <w:r>
+              <w:rPr>
+                <w:rStyle w:val="VerbatimChar"/>
+              </w:rPr>
+              <w:t xml:space="preserve">score</w:t>
+            </w:r>
+            <w:r>
+              <w:t xml:space="preserve">,</w:t>
+            </w:r>
+            <w:r>
+              <w:t xml:space="preserve"> </w:t>
+            </w:r>
+            <w:r>
+              <w:rPr>
+                <w:rStyle w:val="VerbatimChar"/>
+              </w:rPr>
+              <w:t xml:space="preserve">basis</w:t>
+            </w:r>
+            <w:r>
+              <w:t xml:space="preserve">,</w:t>
+            </w:r>
+            <w:r>
+              <w:t xml:space="preserve"> </w:t>
+            </w:r>
+            <w:r>
+              <w:rPr>
+                <w:rStyle w:val="VerbatimChar"/>
+              </w:rPr>
+              <w:t xml:space="preserve">audience</w:t>
+            </w:r>
+            <w:r>
+              <w:t xml:space="preserve">,</w:t>
+            </w:r>
+            <w:r>
+              <w:t xml:space="preserve"> </w:t>
+            </w:r>
+            <w:r>
+              <w:rPr>
+                <w:rStyle w:val="VerbatimChar"/>
+              </w:rPr>
+              <w:t xml:space="preserve">scale</w:t>
+            </w:r>
+            <w:r>
+              <w:t xml:space="preserve">,</w:t>
+            </w:r>
+            <w:r>
+              <w:t xml:space="preserve"> </w:t>
+            </w:r>
+            <w:r>
+              <w:rPr>
+                <w:rStyle w:val="VerbatimChar"/>
+              </w:rPr>
+              <w:t xml:space="preserve">quote</w:t>
+            </w:r>
+            <w:r>
+              <w:t xml:space="preserve">,</w:t>
+            </w:r>
+            <w:r>
+              <w:t xml:space="preserve"> </w:t>
+            </w:r>
+            <w:r>
+              <w:rPr>
+                <w:rStyle w:val="VerbatimChar"/>
+              </w:rPr>
+              <w:t xml:space="preserve">source_url</w:t>
+            </w:r>
+            <w:r>
+              <w:t xml:space="preserve">,</w:t>
+            </w:r>
+            <w:r>
+              <w:t xml:space="preserve"> </w:t>
+            </w:r>
+            <w:r>
+              <w:rPr>
+                <w:rStyle w:val="VerbatimChar"/>
+              </w:rPr>
+              <w:t xml:space="preserve">as_at</w:t>
+            </w:r>
+            <w:r>
+              <w:t xml:space="preserve">).</w:t>
+            </w:r>
+            <w:r>
+              <w:t xml:space="preserve"> </w:t>
+            </w:r>
+            <w:r>
+              <w:rPr>
+                <w:rStyle w:val="VerbatimChar"/>
+              </w:rPr>
+              <w:t xml:space="preserve">min_score</w:t>
+            </w:r>
+            <w:r>
+              <w:t xml:space="preserve"> </w:t>
+            </w:r>
+            <w:r>
+              <w:t xml:space="preserve">and</w:t>
+            </w:r>
+            <w:r>
+              <w:t xml:space="preserve"> </w:t>
+            </w:r>
+            <w:r>
+              <w:rPr>
+                <w:rStyle w:val="VerbatimChar"/>
+              </w:rPr>
+              <w:t xml:space="preserve">min_score_basis</w:t>
+            </w:r>
+            <w:r>
+              <w:t xml:space="preserve"> </w:t>
+            </w:r>
+            <w:r>
+              <w:t xml:space="preserve">are unchanged. Section 7.9 and acceptance test 24 added</w:t>
             </w:r>
           </w:p>
         </w:tc>
@@ -21740,7 +23619,7 @@
         <w:color w:val="606060"/>
         <w:sz w:val="16"/>
       </w:rPr>
-      <w:t>website-api-v2 · Version 2 · Issue 6 · 31 October 2026 · Pilot</w:t>
+      <w:t>website-api-v2 · Version 2 · Issue 7 · 31 October 2026 · Pilot</w:t>
     </w:r>
   </w:p>
 </w:ftr>
@@ -22190,6 +24069,9 @@
     <w:abstractNumId w:val="991"/>
   </w:num>
   <w:num w:numId="1011">
+    <w:abstractNumId w:val="991"/>
+  </w:num>
+  <w:num w:numId="1012">
     <w:abstractNumId w:val="99411"/>
     <w:lvlOverride w:ilvl="0">
       <w:startOverride w:val="1"/>
@@ -22219,13 +24101,13 @@
       <w:startOverride w:val="1"/>
     </w:lvlOverride>
   </w:num>
-  <w:num w:numId="1012">
-    <w:abstractNumId w:val="991"/>
-  </w:num>
   <w:num w:numId="1013">
     <w:abstractNumId w:val="991"/>
   </w:num>
   <w:num w:numId="1014">
+    <w:abstractNumId w:val="991"/>
+  </w:num>
+  <w:num w:numId="1015">
     <w:abstractNumId w:val="991"/>
   </w:num>
 </w:numbering>

</xml_diff>